<commit_message>
Refine report content for clarity and accuracy; improve language consistency and structure in sections 1.2, 1.3, 1.4, and 2. Enhance problem statements and objectives related to the Speak2Plan system, ensuring better understanding of challenges and proposed solutions.
</commit_message>
<xml_diff>
--- a/reports/report.docx
+++ b/reports/report.docx
@@ -101,7 +101,7 @@
       </w:pPr>
       <w:r>
         <w:rPr/>
-        <w:t xml:space="preserve">Speak2Plan คือระบบสั่งงาน Google Tasks และ Google Calendar ด้วยเสียงภาษาไทยปนอังกฤษ เช่น "เช็ค task ใน google ให้หน่อย" แล้วระบบตอบกลับเป็นเสียง ผู้ใช้จัดการงานและนัดหมายได้โดยไม่ต้องเปิดแอปหรือพิมพ์</w:t>
+        <w:t xml:space="preserve">Speak2Plan คือระบบสั่งงาน Google Tasks และ Google Calendar ด้วยเสียงภาษาไทยผสมภาษาอังกฤษ เช่น "เช็ค task ใน google ให้หน่อย" แล้วระบบตอบกลับเป็นเสียง ผู้ใช้จัดการงานและนัดหมายได้โดยไม่ต้องเปิดแอปหรือพิมพ์</w:t>
       </w:r>
     </w:p>
     <w:p>
@@ -118,7 +118,7 @@
       <w:pPr>
         <w:numPr>
           <w:ilvl w:val="0"/>
-          <w:numId w:val="1"/>
+          <w:numId w:val="16"/>
         </w:numPr>
         <w:spacing w:lineRule="auto"/>
       </w:pPr>
@@ -126,18 +126,18 @@
         <w:rPr>
           <w:b/>
         </w:rPr>
-        <w:t xml:space="preserve">ผู้ช่วยเสียงทั่วไปรองรับภาษาไทยปนอังกฤษได้ไม่ดี</w:t>
-      </w:r>
-      <w:r>
-        <w:rPr/>
-        <w:t xml:space="preserve"> คนไทยมักพูดศัพท์อังกฤษปนในประโยค (task, meeting, to do, done) ซึ่ง ASR ทั่วไปมักถอดคำอังกฤษเป็นภาษาไทยผิด ๆ</w:t>
+        <w:t xml:space="preserve">ผู้ช่วยเสียงทั่วไปรองรับภาษาไทยผสมภาษาอังกฤษได้ไม่ดี</w:t>
+      </w:r>
+      <w:r>
+        <w:rPr/>
+        <w:t xml:space="preserve"> คนไทยมักพูดศัพท์อังกฤษปนในประโยค เช่น คำว่า task, meeting, to do, done ซึ่ง ASR ทั่วไปมักถอดคำอังกฤษเป็นภาษาไทยผิด ๆ</w:t>
       </w:r>
     </w:p>
     <w:p>
       <w:pPr>
         <w:numPr>
           <w:ilvl w:val="0"/>
-          <w:numId w:val="1"/>
+          <w:numId w:val="16"/>
         </w:numPr>
         <w:spacing w:lineRule="auto"/>
       </w:pPr>
@@ -145,18 +145,18 @@
         <w:rPr>
           <w:b/>
         </w:rPr>
-        <w:t xml:space="preserve">Whisper สำเร็จรูปรุ่นเล็กถอดเสียงไทยได้ไม่แม่น</w:t>
-      </w:r>
-      <w:r>
-        <w:rPr/>
-        <w:t xml:space="preserve"> Whisper-tiny มี CER 0.638 บน FLEURS และ 0.763 บนเสียงคำสั่งจริง บางครั้งสร้างข้อความซ้ำเกินจากเสียงต้นฉบับ</w:t>
+        <w:t xml:space="preserve">Whisper model tiny ถอดเสียงไทยได้ไม่แม่น</w:t>
+      </w:r>
+      <w:r>
+        <w:rPr/>
+        <w:t xml:space="preserve"> บางครั้งสร้างข้อความซ้ำเกินจากเสียงต้นฉบับ</w:t>
       </w:r>
     </w:p>
     <w:p>
       <w:pPr>
         <w:numPr>
           <w:ilvl w:val="0"/>
-          <w:numId w:val="1"/>
+          <w:numId w:val="16"/>
         </w:numPr>
         <w:spacing w:lineRule="auto"/>
       </w:pPr>
@@ -164,18 +164,18 @@
         <w:rPr>
           <w:b/>
         </w:rPr>
-        <w:t xml:space="preserve">ภาษาไทยไม่มีช่องว่างระหว่างคำ</w:t>
-      </w:r>
-      <w:r>
-        <w:rPr/>
-        <w:t xml:space="preserve"> ต้องตัดคำก่อนจำแนก และข้อความจาก ASR ตัดคำไม่เหมือนข้อความใน dataset ที่เว้นวรรคไว้แล้ว</w:t>
+        <w:t xml:space="preserve">ภาษาไทยไม่มีช่องว่างระหว่างคำ ต้องตัดคำก่อนจำแนก</w:t>
+      </w:r>
+      <w:r>
+        <w:rPr/>
+        <w:t xml:space="preserve"> และข้อความจาก ASR ตัดคำไม่เหมือนข้อความใน dataset ที่เว้นวรรคไว้แล้ว</w:t>
       </w:r>
     </w:p>
     <w:p>
       <w:pPr>
         <w:numPr>
           <w:ilvl w:val="0"/>
-          <w:numId w:val="1"/>
+          <w:numId w:val="16"/>
         </w:numPr>
         <w:spacing w:lineRule="auto"/>
       </w:pPr>
@@ -183,18 +183,18 @@
         <w:rPr>
           <w:b/>
         </w:rPr>
-        <w:t xml:space="preserve">ข้อมูลคำสั่งภาษาไทยในโดเมนนี้มีน้อย</w:t>
-      </w:r>
-      <w:r>
-        <w:rPr/>
-        <w:t xml:space="preserve"> ชุดข้อมูลสาธารณะ MASSIVE มีคำสั่งเกี่ยวกับรายการงานและปฏิทินไม่มาก โดยหมวด "lists" ส่วนใหญ่เป็นรายการซื้อของ</w:t>
+        <w:t xml:space="preserve">ข้อมูลคำสั่งภาษาไทยนี้มีน้อยใน Public Dataset</w:t>
+      </w:r>
+      <w:r>
+        <w:rPr/>
+        <w:t xml:space="preserve"> มีคำสั่งเกี่ยวกับรายการงานและปฏิทินไม่มาก</w:t>
       </w:r>
     </w:p>
     <w:p>
       <w:pPr>
         <w:numPr>
           <w:ilvl w:val="0"/>
-          <w:numId w:val="1"/>
+          <w:numId w:val="16"/>
         </w:numPr>
         <w:spacing w:lineRule="auto"/>
       </w:pPr>
@@ -202,18 +202,18 @@
         <w:rPr>
           <w:b/>
         </w:rPr>
-        <w:t xml:space="preserve">ความผิดพลาดสะสมข้ามขั้นตอน</w:t>
-      </w:r>
-      <w:r>
-        <w:rPr/>
-        <w:t xml:space="preserve"> ASR ถอดคำสำคัญผิดเพียงคำเดียว ("นัด" เป็น "นับ", "done" เป็น "ตอน") ทำให้ intent พลิกหรือบันทึกวันเวลาผิดใน Google ได้</w:t>
+        <w:t xml:space="preserve">ความผิดพลาดตอนถอดคำสำคัญผิดเพียงคำเดียว</w:t>
+      </w:r>
+      <w:r>
+        <w:rPr/>
+        <w:t xml:space="preserve"> เช่น "นัด" เป็น "นับ", "done" เป็น "ตอน" ทำให้ความหมายผิด</w:t>
       </w:r>
     </w:p>
     <w:p>
       <w:pPr>
         <w:numPr>
           <w:ilvl w:val="0"/>
-          <w:numId w:val="1"/>
+          <w:numId w:val="16"/>
         </w:numPr>
         <w:spacing w:lineRule="auto"/>
       </w:pPr>
@@ -221,7 +221,7 @@
         <w:rPr>
           <w:b/>
         </w:rPr>
-        <w:t xml:space="preserve">การเขียนข้อมูลลง Google ต้องปลอดภัย</w:t>
+        <w:t xml:space="preserve">การเขียนข้อมูลลง Google ต้องมั่นใจ</w:t>
       </w:r>
       <w:r>
         <w:rPr/>
@@ -248,7 +248,7 @@
       </w:pPr>
       <w:r>
         <w:rPr/>
-        <w:t xml:space="preserve">พัฒนาระบบรับคำสั่งเสียงภาษาไทยปนอังกฤษเพื่ออ่านและจัดการงานหรือนัดหมายใน Google Tasks และ Google Calendar</w:t>
+        <w:t xml:space="preserve">พัฒนาระบบรับคำสั่งเสียงภาษาไทยผสมภาษาอังกฤษเพื่ออ่านและจัดการงานหรือนัดหมายใน Google Tasks และ Google Calendar</w:t>
       </w:r>
     </w:p>
     <w:p>
@@ -261,7 +261,7 @@
       </w:pPr>
       <w:r>
         <w:rPr/>
-        <w:t xml:space="preserve">ปรับแต่งโมเดลถอดเสียงและเปรียบเทียบโมเดลจำแนกเจตนา เพื่อเลือกชุดโมเดลที่เหมาะกับคำสั่งในโดเมนนี้</w:t>
+        <w:t xml:space="preserve">ปรับแต่งโมเดลถอดเสียงและเปรียบเทียบโมเดลแยกตามวัตถุประสงค์ เพื่อเลือกชุดโมเดลที่เหมาะกับคำสั่ง</w:t>
       </w:r>
     </w:p>
     <w:p>
@@ -274,7 +274,7 @@
       </w:pPr>
       <w:r>
         <w:rPr/>
-        <w:t xml:space="preserve">ประเมินความถูกต้องของการถอดเสียง การจำแนกเจตนา การสกัดข้อมูล และผลลัพธ์ทั้งระบบด้วยเสียงคำสั่งจริง</w:t>
+        <w:t xml:space="preserve">ประเมินความถูกต้องของการถอดเสียง การแยกตามวัตถุประสงค์ การดึงข้อมูล และผลลัพธ์ทั้งระบบด้วยเสียงคำสั่งจริง</w:t>
       </w:r>
     </w:p>
     <w:p>
@@ -306,7 +306,7 @@
       </w:pPr>
       <w:r>
         <w:rPr/>
-        <w:t xml:space="preserve">ระบบรองรับ 6 เจตนา ได้แก่ การดูงาน เพิ่มงาน ปิดงาน ดูนัดหมาย เพิ่มนัดหมาย และคำสั่งอื่น ๆ การทดลองใช้ข้อมูลภาษาไทยและอังกฤษจาก MASSIVE ข้อมูลเสียงภาษาไทยจาก FLEURS และชุดเสียงคำสั่งที่ผู้พัฒนาอัดเอง 60 ประโยค การประเมินการเชื่อมต่อ Google ที่เขียนข้อมูลยังจำกัดอยู่ที่การตรวจขั้นยืนยันและการยกเลิกคำสั่ง โดยยังไม่ได้ทดสอบการเพิ่มนัดหมายลง Google Calendar จริง</w:t>
+        <w:t xml:space="preserve">ระบบรองรับการทำงาน 6 แบบ ได้แก่ การดูงาน เพิ่มงาน ปิดงาน ดูนัดหมาย เพิ่มนัดหมาย และคำสั่งอื่น ๆ การทดลองใช้ข้อมูลภาษาไทยและอังกฤษจาก Dataset ของ MASSIVE ข้อมูลเสียงภาษาไทยจาก Dataset ของ FLEURS และชุดเสียงคำสั่งที่ผู้พัฒนาอัดเอง 60 ประโยค การประเมินการเชื่อมต่อกับบริการของ Google ซึ่งเกี่ยวข้องกับการเพิ่มหรือแก้ไขข้อมูล ยังครอบคลุมเฉพาะการตรวจสอบว่าระบบขอการยืนยันจากผู้ใช้ก่อนดำเนินการ และสามารถยกเลิกคำสั่งได้อย่างถูกต้อง</w:t>
       </w:r>
     </w:p>
     <w:p>
@@ -325,14 +325,14 @@
       </w:pPr>
       <w:r>
         <w:rPr/>
-        <w:t xml:space="preserve">แนวคิดหลักคือแยกงานเป็น pipeline ที่ train เอง 2 ส่วน คือ ASR (fine-tune Whisper) และ Intent Classifier (train from scratch) ส่วนที่เหลือใช้ rule-based และ API สำเร็จรูป เพื่อให้แต่ละส่วนวัดผลและปรับปรุงแยกกันได้</w:t>
+        <w:t xml:space="preserve">แนวคิดหลักคือแบ่งการทำงานของระบบออกเป็นหลายขั้นตอน โดยมี 2 ส่วนที่ฝึกโมเดลเอง ได้แก่ ระบบแปลงเสียงเป็นข้อความซึ่งนำ Model ของ Whisper มาปรับให้เหมาะกับข้อมูลภาษาไทย และระบบแยกตามวัตถุประสงค์ของผู้ใช้ ซึ่งฝึกโมเดลขึ้นใหม่</w:t>
       </w:r>
     </w:p>
     <w:p>
       <w:pPr>
         <w:numPr>
           <w:ilvl w:val="0"/>
-          <w:numId w:val="3"/>
+          <w:numId w:val="17"/>
         </w:numPr>
         <w:spacing w:lineRule="auto"/>
       </w:pPr>
@@ -340,18 +340,18 @@
         <w:rPr>
           <w:b/>
         </w:rPr>
-        <w:t xml:space="preserve">ถอดเสียงภาษาไทยให้แม่นขึ้น:</w:t>
-      </w:r>
-      <w:r>
-        <w:rPr/>
-        <w:t xml:space="preserve"> Fine-tune Whisper ด้วย FLEURS ภาษาไทย และใช้ LoRA เพื่อฝึก Whisper-small บน GPU 4GB</w:t>
+        <w:t xml:space="preserve">เพิ่มความแม่นยำในการแปลงเสียงภาษาไทยเป็นข้อความ:</w:t>
+      </w:r>
+      <w:r>
+        <w:rPr/>
+        <w:t xml:space="preserve"> ปรับ Model ของ Whisper เพิ่มเติมด้วยข้อมูลภาษาไทยจาก Dataset ของ FLEURS และใช้เทคนิค LoRA เพื่อให้สามารถฝึก Whisper-small บน GPU ขนาด 4GB ได้</w:t>
       </w:r>
     </w:p>
     <w:p>
       <w:pPr>
         <w:numPr>
           <w:ilvl w:val="0"/>
-          <w:numId w:val="3"/>
+          <w:numId w:val="17"/>
         </w:numPr>
         <w:spacing w:lineRule="auto"/>
       </w:pPr>
@@ -359,18 +359,18 @@
         <w:rPr>
           <w:b/>
         </w:rPr>
-        <w:t xml:space="preserve">รองรับคำสั่งและคำภาษาอังกฤษที่ไม่มีใน FLEURS:</w:t>
-      </w:r>
-      <w:r>
-        <w:rPr/>
-        <w:t xml:space="preserve"> เพิ่มเสียง TTS ของประโยคคำสั่งและเสียงผู้ใช้จริงในชุดฝึก (speaker adaptation)</w:t>
+        <w:t xml:space="preserve">รองรับคำสั่งและคำภาษาอังกฤษที่ไม่มีใน Dataset ของ FLEURS:</w:t>
+      </w:r>
+      <w:r>
+        <w:rPr/>
+        <w:t xml:space="preserve"> เพิ่มเสียงสังเคราะห์จากข้อความและเสียงของผู้ใช้จริงลงในชุดข้อมูลฝึก เพื่อให้โมเดลคุ้นเคยกับรูปแบบคำสั่งและเสียงของผู้ใช้มากขึ้น</w:t>
       </w:r>
     </w:p>
     <w:p>
       <w:pPr>
         <w:numPr>
           <w:ilvl w:val="0"/>
-          <w:numId w:val="3"/>
+          <w:numId w:val="17"/>
         </w:numPr>
         <w:spacing w:lineRule="auto"/>
       </w:pPr>
@@ -378,18 +378,18 @@
         <w:rPr>
           <w:b/>
         </w:rPr>
-        <w:t xml:space="preserve">จำแนกความต้องการของผู้ใช้:</w:t>
-      </w:r>
-      <w:r>
-        <w:rPr/>
-        <w:t xml:space="preserve"> กำหนด 6 intent แล้วฝึกและเปรียบเทียบ Naive Bayes, Logistic Regression, TextCNN และ BiLSTM โดยทดลอง Logistic Regression ทั้งแบบใช้คำและแบบใช้คำร่วมกับตัวอักษร</w:t>
+        <w:t xml:space="preserve">จำแนกสิ่งที่ผู้ใช้ต้องการ:</w:t>
+      </w:r>
+      <w:r>
+        <w:rPr/>
+        <w:t xml:space="preserve"> แบ่งคำสั่งออกเป็น 6 แบบ จากนั้นฝึกและเปรียบเทียบโมเดล Naive Bayes, Logistic Regression, TextCNN และ BiLSTM โดยทดสอบ Logistic Regression ทั้งแบบวิเคราะห์เป็นคำ และแบบวิเคราะห์ทั้งคำและตัวอักษร</w:t>
       </w:r>
     </w:p>
     <w:p>
       <w:pPr>
         <w:numPr>
           <w:ilvl w:val="0"/>
-          <w:numId w:val="3"/>
+          <w:numId w:val="17"/>
         </w:numPr>
         <w:spacing w:lineRule="auto"/>
       </w:pPr>
@@ -397,18 +397,18 @@
         <w:rPr>
           <w:b/>
         </w:rPr>
-        <w:t xml:space="preserve">เพิ่มข้อมูลคำสั่งในโดเมนนี้:</w:t>
-      </w:r>
-      <w:r>
-        <w:rPr/>
-        <w:t xml:space="preserve"> เพราะข้อมูลมีน้อยและหมวด "lists" ใน MASSIVE ส่วนใหญ่เป็นรายการซื้อของ จึงเพิ่มประโยคที่เขียนเองและที่ Claude เขียน แล้ว oversample ×3</w:t>
+        <w:t xml:space="preserve">เพิ่มข้อมูลคำสั่งเกี่ยวกับงานและปฏิทิน:</w:t>
+      </w:r>
+      <w:r>
+        <w:rPr/>
+        <w:t xml:space="preserve"> ข้อมูลภาษาไทยด้านนี้ยังมีน้อย และข้อมูลหมวด “lists” ใน Dataset ของ MASSIVE ส่วนใหญ่เป็นคำสั่งเกี่ยวกับรายการซื้อของ จึงต้องเพิ่มประโยคที่ผู้พัฒนาและ Claude สร้างขึ้น และเพิ่มจำนวนตัวอย่างในชุดฝึกเป็น 3 เท่า</w:t>
       </w:r>
     </w:p>
     <w:p>
       <w:pPr>
         <w:numPr>
           <w:ilvl w:val="0"/>
-          <w:numId w:val="3"/>
+          <w:numId w:val="17"/>
         </w:numPr>
         <w:spacing w:lineRule="auto"/>
       </w:pPr>
@@ -416,18 +416,18 @@
         <w:rPr>
           <w:b/>
         </w:rPr>
-        <w:t xml:space="preserve">ลดผลกระทบจากข้อผิดพลาดของ ASR ต่อ intent:</w:t>
-      </w:r>
-      <w:r>
-        <w:rPr/>
-        <w:t xml:space="preserve"> สร้างข้อความที่มีข้อผิดพลาดแบบ ASR จริง (gTTS → perturb → Whisper) เพื่อฝึกโมเดลจำแนก intent</w:t>
+        <w:t xml:space="preserve">ลดผลกระทบจากการแปลงเสียงเป็นข้อความผิด:</w:t>
+      </w:r>
+      <w:r>
+        <w:rPr/>
+        <w:t xml:space="preserve"> สร้างตัวอย่างข้อความที่เลียนแบบข้อผิดพลาดซึ่งเกิดจากระบบ ASR จริง โดยนำข้อความไปสร้างเป็นเสียงด้วย gTTS ปรับคุณภาพเสียง แล้วแปลงกลับเป็นข้อความด้วย Whisper จากนั้นนำข้อความที่ได้ไปใช้ฝึกโมเดลแยกตามวัตถุประสงค์</w:t>
       </w:r>
     </w:p>
     <w:p>
       <w:pPr>
         <w:numPr>
           <w:ilvl w:val="0"/>
-          <w:numId w:val="3"/>
+          <w:numId w:val="17"/>
         </w:numPr>
         <w:spacing w:lineRule="auto"/>
       </w:pPr>
@@ -435,18 +435,18 @@
         <w:rPr>
           <w:b/>
         </w:rPr>
-        <w:t xml:space="preserve">ดึงวันและเวลาที่พูดได้หลายรูปแบบ:</w:t>
-      </w:r>
-      <w:r>
-        <w:rPr/>
-        <w:t xml:space="preserve"> ใช้กฎสกัดข้อมูล เช่น “พรุ่งนี้”, “วันศุกร์หน้า”, “บ่ายสอง”, “ทุ่มนึง” และ “3pm”</w:t>
+        <w:t xml:space="preserve">ระบุวันและเวลาจากคำพูดหลายรูปแบบ:</w:t>
+      </w:r>
+      <w:r>
+        <w:rPr/>
+        <w:t xml:space="preserve"> ใช้กฎที่กำหนดไว้เพื่อดึงข้อมูลสำคัญจากคำสั่ง เช่น “พรุ่งนี้” “วันศุกร์หน้า” “บ่ายสอง” “ทุ่มนึง” และ “3pm”</w:t>
       </w:r>
     </w:p>
     <w:p>
       <w:pPr>
         <w:numPr>
           <w:ilvl w:val="0"/>
-          <w:numId w:val="3"/>
+          <w:numId w:val="17"/>
         </w:numPr>
         <w:spacing w:lineRule="auto"/>
       </w:pPr>
@@ -454,20 +454,20 @@
         <w:rPr>
           <w:b/>
         </w:rPr>
-        <w:t xml:space="preserve">ป้องกันการบันทึกข้อมูลผิดลง Google:</w:t>
-      </w:r>
-      <w:r>
-        <w:rPr/>
-        <w:t xml:space="preserve"> ให้ผู้ใช้ตรวจชื่อ วัน และเวลาก่อนบันทึก โดยถามยืนยัน “ใช่ไหม” ทุกครั้งที่คำสั่งจะเขียนข้อมูล และยกเลิกเมื่อคำตอบไม่ชัดเจน</w:t>
-      </w:r>
-    </w:p>
-    <w:p>
-      <w:pPr>
-        <w:spacing w:lineRule="auto"/>
-      </w:pPr>
-      <w:r>
-        <w:rPr/>
-        <w:t xml:space="preserve">การแยก ASR กับ intent ทำให้สลับโมเดลได้อิสระ ถ้า fine-tune ไม่ดีขึ้นก็กลับไปใช้ Whisper สำเร็จรูปได้ทันที</w:t>
+        <w:t xml:space="preserve">ป้องกันการบันทึกข้อมูลผิดลงในบริการของ Google:</w:t>
+      </w:r>
+      <w:r>
+        <w:rPr/>
+        <w:t xml:space="preserve"> ให้ผู้ใช้ตรวจสอบชื่องานหรือชื่อนัดหมาย รวมถึงวันและเวลา ก่อนบันทึกข้อมูล โดยระบบจะถามยืนยันทุกครั้ง และยกเลิกคำสั่งเมื่อคำตอบของผู้ใช้ไม่ชัดเจน</w:t>
+      </w:r>
+    </w:p>
+    <w:p>
+      <w:pPr>
+        <w:spacing w:lineRule="auto"/>
+      </w:pPr>
+      <w:r>
+        <w:rPr/>
+        <w:t xml:space="preserve">การแยกระบบแปลงเสียงเป็นข้อความออกจากระบบแยกตามวัตถุประสงค์ ทำให้สามารถเปลี่ยนโมเดลในแต่ละส่วนได้อย่างอิสระ หาก Whisper ที่ปรับเพิ่มเติมแล้วไม่ให้ผลลัพธ์ดีขึ้น ก็สามารถกลับไปใช้ Whisper รุ่นสำเร็จรูปได้ทันที</w:t>
       </w:r>
     </w:p>
     <w:p>
@@ -8532,6 +8532,12 @@
   </w:num>
   <w:num w:numId="15">
     <w:abstractNumId w:val="15"/>
+  </w:num>
+  <w:num w:numId="16">
+    <w:abstractNumId w:val="2"/>
+  </w:num>
+  <w:num w:numId="17">
+    <w:abstractNumId w:val="2"/>
   </w:num>
 </w:numbering>
 </file>

</xml_diff>

<commit_message>
Refactor: report.md for clarity and consistency in project description, workflow, and model development. Update sections on system operation, model selection, and dataset details to enhance readability and understanding of the Speak2Plan project.
</commit_message>
<xml_diff>
--- a/reports/report.docx
+++ b/reports/report.docx
@@ -486,7 +486,7 @@
       </w:pPr>
       <w:r>
         <w:rPr/>
-        <w:t xml:space="preserve">โครงการพัฒนาแบบวนซ้ำ ได้แก่ ฝึกโมเดล ทดสอบกับเสียงจริง วิเคราะห์ข้อผิดพลาด และปรับข้อมูลหรือโมเดลก่อนฝึกใหม่ รายงานใช้รหัสอ้างอิงสองกลุ่มดังนี้</w:t>
+        <w:t xml:space="preserve">โครงการพัฒนาด้วยการทดลองหลายรอบ โดยฝึกโมเดล ทดสอบกับเสียงจริง ตรวจสอบข้อผิดพลาด แล้วปรับข้อมูลหรือโมเดลก่อนฝึกใหม่ ในรายงานใช้รหัสสองกลุ่มเพื่อเรียกชื่อการทดลองให้อ่านง่าย ดังนี้</w:t>
       </w:r>
     </w:p>
     <w:p>
@@ -505,7 +505,7 @@
       </w:r>
       <w:r>
         <w:rPr/>
-        <w:t xml:space="preserve"> รหัสโมเดลถอดเสียงที่ใช้ในการทดลอง 7 แบบ ครอบคลุมทั้ง Whisper-tiny และ Whisper-small แบบสำเร็จรูปและแบบปรับแต่ง รหัสนี้กำหนดขึ้นในรายงาน โดยชื่อโมเดลและโฟลเดอร์ที่ตรงกับแต่ละรหัสระบุในหัวข้อ 3.4.2</w:t>
+        <w:t xml:space="preserve"> รหัสแทนโมเดลถอดเสียง 7 แบบ ซึ่งมีทั้ง Whisper-tiny และ Whisper-small รุ่นสำเร็จรูปและรุ่นที่ปรับเพิ่มเติม รายละเอียดของแต่ละรหัสอยู่ในหัวข้อ 3.4.2</w:t>
       </w:r>
     </w:p>
     <w:p>
@@ -524,7 +524,7 @@
       </w:r>
       <w:r>
         <w:rPr/>
-        <w:t xml:space="preserve"> รหัสชุดข้อมูลฝึกสำหรับจำแนกเจตนา 4 รุ่น แต่ละชุดใช้ฝึกโมเดลหลายแบบ เช่น Naive Bayes และ TextCNN ดังนั้นการระบุโมเดลจำแนกเจตนาต้องบอกทั้งชื่อโมเดลและชุดข้อมูลที่ใช้ฝึก เช่น “Naive Bayes ที่ฝึกด้วยชุดข้อมูล I4”</w:t>
+        <w:t xml:space="preserve"> รหัสแทนชุดข้อมูลฝึก 4 รุ่นสำหรับสอนโมเดลให้แยกสิ่งที่ผู้ใช้ต้องการ ชุดข้อมูลแต่ละรุ่นนำไปฝึกได้หลายโมเดล เช่น Naive Bayes และ TextCNN จึงต้องระบุทั้งชื่อโมเดลและรหัสชุดข้อมูล เช่น “Naive Bayes ที่ฝึกด้วยชุดข้อมูล I4”</w:t>
       </w:r>
     </w:p>
     <w:p>
@@ -547,15 +547,15 @@
       </w:pPr>
       <w:r>
         <w:rPr/>
-        <w:t xml:space="preserve">เตรียมข้อมูล: โหลด MASSIVE (th-TH, en-US) แมปเป็น 6 intent และโหลด FLEURS </w:t>
-      </w:r>
-      <w:r>
-        <w:rPr/>
-        <w:t xml:space="preserve">th_th</w:t>
-      </w:r>
-      <w:r>
-        <w:rPr/>
-        <w:t xml:space="preserve"> สำหรับ ASR</w:t>
+        <w:t xml:space="preserve">เตรียมข้อมูลจาก Dataset ของ MASSIVE ภาษาไทยและอังกฤษ แล้วจัดคำสั่งเป็น 6 แบบ พร้อมเตรียมเสียงภาษาไทยจาก Dataset ของ FLEURS สำหรับฝึกระบบแปลงเสียงเป็นข้อความ</w:t>
+      </w:r>
+      <w:r>
+        <w:rPr/>
+        <w:t xml:space="preserve"/>
+      </w:r>
+      <w:r>
+        <w:rPr/>
+        <w:t xml:space="preserve"/>
       </w:r>
     </w:p>
     <w:p>
@@ -568,7 +568,7 @@
       </w:pPr>
       <w:r>
         <w:rPr/>
-        <w:t xml:space="preserve">ทำ Google OAuth และทดสอบ list tasks / list events ตั้งแต่ต้น</w:t>
+        <w:t xml:space="preserve">เชื่อมต่อบัญชี Google ด้วย OAuth และทดสอบการอ่านรายการงานกับนัดหมาย</w:t>
       </w:r>
     </w:p>
     <w:p>
@@ -581,7 +581,7 @@
       </w:pPr>
       <w:r>
         <w:rPr/>
-        <w:t xml:space="preserve">เทรน baseline intent (Naive Bayes, Logistic Regression บน TF-IDF) และวัด CER ของ Whisper สำเร็จรูป</w:t>
+        <w:t xml:space="preserve">ฝึกโมเดลเริ่มต้น ได้แก่ Naive Bayes และ Logistic Regression แล้ววัดความผิดพลาดของ Whisper รุ่นสำเร็จรูป</w:t>
       </w:r>
     </w:p>
     <w:p>
@@ -594,7 +594,7 @@
       </w:pPr>
       <w:r>
         <w:rPr/>
-        <w:t xml:space="preserve">Fine-tune Whisper-tiny และเทรน TextCNN / BiLSTM from scratch</w:t>
+        <w:t xml:space="preserve">ปรับ Whisper-tiny เพิ่มเติม และฝึก TextCNN กับ BiLSTM ขึ้นใหม่</w:t>
       </w:r>
     </w:p>
     <w:p>
@@ -607,7 +607,7 @@
       </w:pPr>
       <w:r>
         <w:rPr/>
-        <w:t xml:space="preserve">อัดเสียงคำสั่งจริงเป็น test set และทดสอบ end-to-end (เสียง → ASR → intent)</w:t>
+        <w:t xml:space="preserve">อัดเสียงคำสั่งจริงเป็นชุดทดสอบ แล้วทดสอบการทำงานตั้งแต่รับเสียงจนทราบว่าผู้ใช้ต้องการทำอะไร</w:t>
       </w:r>
     </w:p>
     <w:p>
@@ -620,7 +620,7 @@
       </w:pPr>
       <w:r>
         <w:rPr/>
-        <w:t xml:space="preserve">วิเคราะห์ error แล้วปรับข้อมูล/โมเดล (ดู iv) วนซ้ำหลายรอบ</w:t>
+        <w:t xml:space="preserve">ตรวจสอบข้อผิดพลาด ปรับข้อมูลหรือโมเดล แล้วทดลองซ้ำหลายรอบ</w:t>
       </w:r>
     </w:p>
     <w:p>
@@ -633,7 +633,7 @@
       </w:pPr>
       <w:r>
         <w:rPr/>
-        <w:t xml:space="preserve">เขียน rule-based slot extraction และวัดผลด้วยเฉลย 30 ประโยค</w:t>
+        <w:t xml:space="preserve">สร้างกฎสำหรับดึงชื่องาน วัน และเวลาจากคำสั่ง แล้วทดสอบกับประโยคที่มีคำตอบกำกับ 30 ประโยค</w:t>
       </w:r>
     </w:p>
     <w:p>
@@ -646,7 +646,7 @@
       </w:pPr>
       <w:r>
         <w:rPr/>
-        <w:t xml:space="preserve">ต่อ pipeline ครบ (พิมพ์ / ไฟล์เสียง / interactive / wake word "เคทู") และทดสอบกับ Google จริง</w:t>
+        <w:t xml:space="preserve">เชื่อมทุกส่วนของระบบเข้าด้วยกันให้รองรับข้อความ ไฟล์เสียง การสนทนาโต้ตอบ และคำปลุก “เคทู” จากนั้นทดสอบกับบริการของ Google</w:t>
       </w:r>
     </w:p>
     <w:p>
@@ -704,31 +704,31 @@
       </w:pPr>
       <w:r>
         <w:rPr/>
-        <w:t xml:space="preserve">Intent แบบอ่าน (</w:t>
-      </w:r>
-      <w:r>
-        <w:rPr/>
-        <w:t xml:space="preserve">check_tasks</w:t>
-      </w:r>
-      <w:r>
-        <w:rPr/>
-        <w:t xml:space="preserve">, </w:t>
-      </w:r>
-      <w:r>
-        <w:rPr/>
-        <w:t xml:space="preserve">check_calendar</w:t>
-      </w:r>
-      <w:r>
-        <w:rPr/>
-        <w:t xml:space="preserve">) เรียก Google API ทันที ส่วน intent แบบเขียนต้องดึง slot และผ่านการยืนยันก่อน intent </w:t>
-      </w:r>
-      <w:r>
-        <w:rPr/>
-        <w:t xml:space="preserve">other</w:t>
-      </w:r>
-      <w:r>
-        <w:rPr/>
-        <w:t xml:space="preserve"> ตอบกลับว่าทำไม่ได้</w:t>
+        <w:t xml:space="preserve">คำสั่งสำหรับอ่านข้อมูล (check_tasks, check_calendar) จะเรียกใช้ Google API ได้ทันที ส่วนคำสั่งที่เพิ่มหรือแก้ไขข้อมูลต้องดึงรายละเอียดสำคัญ เช่น ชื่องาน วัน และเวลา แล้วให้ผู้ใช้ยืนยันก่อน หากคำสั่งอยู่ในกลุ่ม other ระบบจะแจ้งว่าไม่สามารถทำตามคำสั่งได้</w:t>
+      </w:r>
+      <w:r>
+        <w:rPr/>
+        <w:t xml:space="preserve"/>
+      </w:r>
+      <w:r>
+        <w:rPr/>
+        <w:t xml:space="preserve"/>
+      </w:r>
+      <w:r>
+        <w:rPr/>
+        <w:t xml:space="preserve"/>
+      </w:r>
+      <w:r>
+        <w:rPr/>
+        <w:t xml:space="preserve"/>
+      </w:r>
+      <w:r>
+        <w:rPr/>
+        <w:t xml:space="preserve"/>
+      </w:r>
+      <w:r>
+        <w:rPr/>
+        <w:t xml:space="preserve"/>
       </w:r>
     </w:p>
     <w:p>
@@ -747,7 +747,7 @@
       </w:pPr>
       <w:r>
         <w:rPr/>
-        <w:t xml:space="preserve">ระบบประกอบด้วยส่วนรับเสียงและตรวจคำปลุก ส่วนถอดเสียงเป็นข้อความ ส่วนจำแนกเจตนาและดึงข้อมูลงานหรือวันเวลา ส่วนเชื่อมต่อ Google Tasks/Calendar และส่วนตอบกลับเป็นเสียง นอกจากนี้ยังมีเครื่องมืออัดเสียงและประเมินผลสำหรับพัฒนาระบบ โดยฝึกโมเดลเองในส่วน ASR และการจำแนกเจตนา ส่วนอื่นใช้กฎหรือบริการสำเร็จรูป</w:t>
+        <w:t xml:space="preserve">ระบบประกอบด้วยส่วนรับเสียงและตรวจคำปลุก ส่วนแปลงเสียงเป็นข้อความ ส่วนแยกสิ่งที่ผู้ใช้ต้องการและดึงรายละเอียดของคำสั่ง ส่วนเชื่อมต่อ Google Tasks และ Google Calendar และส่วนตอบกลับเป็นเสียง นอกจากนี้ยังมีเครื่องมือสำหรับอัดเสียงและวัดผล โดยฝึกโมเดลเองในส่วนแปลงเสียงเป็นข้อความและส่วนแยกคำสั่ง ส่วนอื่นใช้กฎหรือบริการสำเร็จรูป</w:t>
       </w:r>
     </w:p>
     <w:p>
@@ -766,15 +766,15 @@
       </w:r>
       <w:r>
         <w:rPr/>
-        <w:t xml:space="preserve"> ใช้ silero-vad ตัดช่วงพูด แล้วตรวจคำว่า “เคทู” ในข้อความที่ ASR ถอดได้ (</w:t>
-      </w:r>
-      <w:r>
-        <w:rPr/>
-        <w:t xml:space="preserve">src/pipeline.py</w:t>
-      </w:r>
-      <w:r>
-        <w:rPr/>
-        <w:t xml:space="preserve">)</w:t>
+        <w:t xml:space="preserve"> ใช้ silero-vad หาเฉพาะช่วงที่มีคนพูด แล้วตรวจหาคำว่า “เคทู” ในข้อความที่ระบบถอดได้ (`src/pipeline.py`)</w:t>
+      </w:r>
+      <w:r>
+        <w:rPr/>
+        <w:t xml:space="preserve"/>
+      </w:r>
+      <w:r>
+        <w:rPr/>
+        <w:t xml:space="preserve"/>
       </w:r>
     </w:p>
     <w:p>
@@ -789,27 +789,27 @@
         <w:rPr>
           <w:b/>
         </w:rPr>
-        <w:t xml:space="preserve">ถอดเสียงเป็นข้อความ (ASR):</w:t>
-      </w:r>
-      <w:r>
-        <w:rPr/>
-        <w:t xml:space="preserve"> Fine-tune Whisper-small ด้วย LoRA เพื่อแปลงเสียงคำสั่งเป็นข้อความ (</w:t>
-      </w:r>
-      <w:r>
-        <w:rPr/>
-        <w:t xml:space="preserve">src/asr.py</w:t>
-      </w:r>
-      <w:r>
-        <w:rPr/>
-        <w:t xml:space="preserve">, </w:t>
-      </w:r>
-      <w:r>
-        <w:rPr/>
-        <w:t xml:space="preserve">src/train_asr.py</w:t>
-      </w:r>
-      <w:r>
-        <w:rPr/>
-        <w:t xml:space="preserve">)</w:t>
+        <w:t xml:space="preserve">แปลงเสียงเป็นข้อความ (ASR):</w:t>
+      </w:r>
+      <w:r>
+        <w:rPr/>
+        <w:t xml:space="preserve"> ปรับ Whisper-small ด้วยเทคนิค LoRA เพื่อให้เหมาะกับเสียงคำสั่งของโครงการ (`src/asr.py`, `src/train_asr.py`)</w:t>
+      </w:r>
+      <w:r>
+        <w:rPr/>
+        <w:t xml:space="preserve"/>
+      </w:r>
+      <w:r>
+        <w:rPr/>
+        <w:t xml:space="preserve"/>
+      </w:r>
+      <w:r>
+        <w:rPr/>
+        <w:t xml:space="preserve"/>
+      </w:r>
+      <w:r>
+        <w:rPr/>
+        <w:t xml:space="preserve"/>
       </w:r>
     </w:p>
     <w:p>
@@ -824,83 +824,83 @@
         <w:rPr>
           <w:b/>
         </w:rPr>
-        <w:t xml:space="preserve">จำแนกเจตนา (Intent Classifier):</w:t>
-      </w:r>
-      <w:r>
-        <w:rPr/>
-        <w:t xml:space="preserve"> ฝึกและเปรียบเทียบ Naive Bayes, Logistic Regression (แบบคำและแบบคำร่วมกับตัวอักษร), TextCNN และ BiLSTM เพื่อจำแนก 6 intent ได้แก่ </w:t>
-      </w:r>
-      <w:r>
-        <w:rPr/>
-        <w:t xml:space="preserve">check_tasks</w:t>
-      </w:r>
-      <w:r>
-        <w:rPr/>
-        <w:t xml:space="preserve">, </w:t>
-      </w:r>
-      <w:r>
-        <w:rPr/>
-        <w:t xml:space="preserve">add_task</w:t>
-      </w:r>
-      <w:r>
-        <w:rPr/>
-        <w:t xml:space="preserve">, </w:t>
-      </w:r>
-      <w:r>
-        <w:rPr/>
-        <w:t xml:space="preserve">complete_task</w:t>
-      </w:r>
-      <w:r>
-        <w:rPr/>
-        <w:t xml:space="preserve">, </w:t>
-      </w:r>
-      <w:r>
-        <w:rPr/>
-        <w:t xml:space="preserve">check_calendar</w:t>
-      </w:r>
-      <w:r>
-        <w:rPr/>
-        <w:t xml:space="preserve">, </w:t>
-      </w:r>
-      <w:r>
-        <w:rPr/>
-        <w:t xml:space="preserve">add_event</w:t>
-      </w:r>
-      <w:r>
-        <w:rPr/>
-        <w:t xml:space="preserve"> และ </w:t>
-      </w:r>
-      <w:r>
-        <w:rPr/>
-        <w:t xml:space="preserve">other</w:t>
-      </w:r>
-      <w:r>
-        <w:rPr/>
-        <w:t xml:space="preserve"> หาก confidence ต่ำกว่า 0.4 ระบบจะตอบว่าไม่เข้าใจ (</w:t>
-      </w:r>
-      <w:r>
-        <w:rPr/>
-        <w:t xml:space="preserve">src/train_intent.py</w:t>
-      </w:r>
-      <w:r>
-        <w:rPr/>
-        <w:t xml:space="preserve">, </w:t>
-      </w:r>
-      <w:r>
-        <w:rPr/>
-        <w:t xml:space="preserve">src/models.py</w:t>
-      </w:r>
-      <w:r>
-        <w:rPr/>
-        <w:t xml:space="preserve">, </w:t>
-      </w:r>
-      <w:r>
-        <w:rPr/>
-        <w:t xml:space="preserve">src/intent.py</w:t>
-      </w:r>
-      <w:r>
-        <w:rPr/>
-        <w:t xml:space="preserve">)</w:t>
+        <w:t xml:space="preserve">แยกสิ่งที่ผู้ใช้ต้องการ:</w:t>
+      </w:r>
+      <w:r>
+        <w:rPr/>
+        <w:t xml:space="preserve"> ฝึกและเปรียบเทียบ Naive Bayes, Logistic Regression, TextCNN และ BiLSTM เพื่อแยกคำสั่งเป็น 6 แบบ ได้แก่ `check_tasks`, `add_task`, `complete_task`, `check_calendar`, `add_event` และ `other` หากโมเดลมั่นใจต่ำกว่า 0.4 ระบบจะตอบว่าไม่เข้าใจ (`src/train_intent.py`, `src/models.py`, `src/intent.py`)</w:t>
+      </w:r>
+      <w:r>
+        <w:rPr/>
+        <w:t xml:space="preserve"/>
+      </w:r>
+      <w:r>
+        <w:rPr/>
+        <w:t xml:space="preserve"/>
+      </w:r>
+      <w:r>
+        <w:rPr/>
+        <w:t xml:space="preserve"/>
+      </w:r>
+      <w:r>
+        <w:rPr/>
+        <w:t xml:space="preserve"/>
+      </w:r>
+      <w:r>
+        <w:rPr/>
+        <w:t xml:space="preserve"/>
+      </w:r>
+      <w:r>
+        <w:rPr/>
+        <w:t xml:space="preserve"/>
+      </w:r>
+      <w:r>
+        <w:rPr/>
+        <w:t xml:space="preserve"/>
+      </w:r>
+      <w:r>
+        <w:rPr/>
+        <w:t xml:space="preserve"/>
+      </w:r>
+      <w:r>
+        <w:rPr/>
+        <w:t xml:space="preserve"/>
+      </w:r>
+      <w:r>
+        <w:rPr/>
+        <w:t xml:space="preserve"/>
+      </w:r>
+      <w:r>
+        <w:rPr/>
+        <w:t xml:space="preserve"/>
+      </w:r>
+      <w:r>
+        <w:rPr/>
+        <w:t xml:space="preserve"/>
+      </w:r>
+      <w:r>
+        <w:rPr/>
+        <w:t xml:space="preserve"/>
+      </w:r>
+      <w:r>
+        <w:rPr/>
+        <w:t xml:space="preserve"/>
+      </w:r>
+      <w:r>
+        <w:rPr/>
+        <w:t xml:space="preserve"/>
+      </w:r>
+      <w:r>
+        <w:rPr/>
+        <w:t xml:space="preserve"/>
+      </w:r>
+      <w:r>
+        <w:rPr/>
+        <w:t xml:space="preserve"/>
+      </w:r>
+      <w:r>
+        <w:rPr/>
+        <w:t xml:space="preserve"/>
       </w:r>
     </w:p>
     <w:p>
@@ -915,27 +915,27 @@
         <w:rPr>
           <w:b/>
         </w:rPr>
-        <w:t xml:space="preserve">ดึงข้อมูลจากคำสั่ง (Slot extraction):</w:t>
-      </w:r>
-      <w:r>
-        <w:rPr/>
-        <w:t xml:space="preserve"> ใช้กฎหาชื่องาน วัน และเวลา เช่น “พรุ่งนี้”, “วันศุกร์หน้า”, “บ่ายสอง” และ “3pm” สำหรับ </w:t>
-      </w:r>
-      <w:r>
-        <w:rPr/>
-        <w:t xml:space="preserve">add_event</w:t>
-      </w:r>
-      <w:r>
-        <w:rPr/>
-        <w:t xml:space="preserve"> หากไม่มีเวลาให้เป็นนัดทั้งวัน หากไม่มีวันให้ใช้วันนี้หรือพรุ่งนี้เมื่อเวลาที่ระบุผ่านไปแล้ว กำหนดระยะนัด 1 ชั่วโมง และตีความ “N โมง” ช่วง 1–6 ที่ไม่มี “เช้า” เป็นช่วงบ่าย (</w:t>
-      </w:r>
-      <w:r>
-        <w:rPr/>
-        <w:t xml:space="preserve">src/slots.py</w:t>
-      </w:r>
-      <w:r>
-        <w:rPr/>
-        <w:t xml:space="preserve">)</w:t>
+        <w:t xml:space="preserve">ดึงรายละเอียดจากคำสั่ง:</w:t>
+      </w:r>
+      <w:r>
+        <w:rPr/>
+        <w:t xml:space="preserve"> ใช้กฎค้นหาชื่องาน วัน และเวลา เช่น “พรุ่งนี้” “วันศุกร์หน้า” “บ่ายสอง” และ “3pm” หากคำสั่งเพิ่มนัดหมายไม่มีเวลา ระบบจะสร้างเป็นนัดหมายตลอดวัน หากไม่มีวัน ระบบจะเลือกวันนี้ หรือเลือกพรุ่งนี้เมื่อเวลาที่ระบุผ่านไปแล้ว นัดหมายทั่วไปกำหนดไว้ 1 ชั่วโมง และคำว่า “1 โมง” ถึง “6 โมง” ที่ไม่มีคำว่า “เช้า” จะตีความเป็นช่วงบ่าย (`src/slots.py`)</w:t>
+      </w:r>
+      <w:r>
+        <w:rPr/>
+        <w:t xml:space="preserve"/>
+      </w:r>
+      <w:r>
+        <w:rPr/>
+        <w:t xml:space="preserve"/>
+      </w:r>
+      <w:r>
+        <w:rPr/>
+        <w:t xml:space="preserve"/>
+      </w:r>
+      <w:r>
+        <w:rPr/>
+        <w:t xml:space="preserve"/>
       </w:r>
     </w:p>
     <w:p>
@@ -954,15 +954,15 @@
       </w:r>
       <w:r>
         <w:rPr/>
-        <w:t xml:space="preserve"> ใช้ OAuth เพื่ออ่าน เพิ่ม และปิดงาน รวมถึงอ่านและเพิ่มนัดหมาย โดยคำสั่งที่เขียนข้อมูลต้องให้ผู้ใช้ยืนยันก่อน (</w:t>
-      </w:r>
-      <w:r>
-        <w:rPr/>
-        <w:t xml:space="preserve">src/google_api.py</w:t>
-      </w:r>
-      <w:r>
-        <w:rPr/>
-        <w:t xml:space="preserve">)</w:t>
+        <w:t xml:space="preserve"> ใช้ OAuth เพื่ออ่าน เพิ่ม และปิดงาน รวมถึงอ่านและเพิ่มนัดหมาย โดยคำสั่งที่เขียนข้อมูลต้องให้ผู้ใช้ยืนยันก่อน (`src/google_api.py`)</w:t>
+      </w:r>
+      <w:r>
+        <w:rPr/>
+        <w:t xml:space="preserve"/>
+      </w:r>
+      <w:r>
+        <w:rPr/>
+        <w:t xml:space="preserve"/>
       </w:r>
     </w:p>
     <w:p>
@@ -981,15 +981,15 @@
       </w:r>
       <w:r>
         <w:rPr/>
-        <w:t xml:space="preserve"> ใช้ gTTS สร้างเสียงตอบกลับให้ผู้ใช้ (</w:t>
-      </w:r>
-      <w:r>
-        <w:rPr/>
-        <w:t xml:space="preserve">src/pipeline.py</w:t>
-      </w:r>
-      <w:r>
-        <w:rPr/>
-        <w:t xml:space="preserve">)</w:t>
+        <w:t xml:space="preserve"> ใช้ gTTS สร้างเสียงตอบกลับให้ผู้ใช้ (`src/pipeline.py`)</w:t>
+      </w:r>
+      <w:r>
+        <w:rPr/>
+        <w:t xml:space="preserve"/>
+      </w:r>
+      <w:r>
+        <w:rPr/>
+        <w:t xml:space="preserve"/>
       </w:r>
     </w:p>
     <w:p>
@@ -1008,31 +1008,31 @@
       </w:r>
       <w:r>
         <w:rPr/>
-        <w:t xml:space="preserve"> ใช้ arecord บันทึกเสียง และวัดผลด้วย CER, WER และ accuracy (</w:t>
-      </w:r>
-      <w:r>
-        <w:rPr/>
-        <w:t xml:space="preserve">src/record.py</w:t>
-      </w:r>
-      <w:r>
-        <w:rPr/>
-        <w:t xml:space="preserve">, </w:t>
-      </w:r>
-      <w:r>
-        <w:rPr/>
-        <w:t xml:space="preserve">src/eval_e2e.py</w:t>
-      </w:r>
-      <w:r>
-        <w:rPr/>
-        <w:t xml:space="preserve">, </w:t>
-      </w:r>
-      <w:r>
-        <w:rPr/>
-        <w:t xml:space="preserve">src/eval_slots.py</w:t>
-      </w:r>
-      <w:r>
-        <w:rPr/>
-        <w:t xml:space="preserve">)</w:t>
+        <w:t xml:space="preserve"> ใช้ arecord บันทึกเสียง แล้ววัดอัตราความผิดพลาดระดับตัวอักษร (CER) ระดับคำ (WER) และสัดส่วนคำตอบที่ถูกต้อง (accuracy) (`src/record.py`, `src/eval_e2e.py`, `src/eval_slots.py`)</w:t>
+      </w:r>
+      <w:r>
+        <w:rPr/>
+        <w:t xml:space="preserve"/>
+      </w:r>
+      <w:r>
+        <w:rPr/>
+        <w:t xml:space="preserve"/>
+      </w:r>
+      <w:r>
+        <w:rPr/>
+        <w:t xml:space="preserve"/>
+      </w:r>
+      <w:r>
+        <w:rPr/>
+        <w:t xml:space="preserve"/>
+      </w:r>
+      <w:r>
+        <w:rPr/>
+        <w:t xml:space="preserve"/>
+      </w:r>
+      <w:r>
+        <w:rPr/>
+        <w:t xml:space="preserve"/>
       </w:r>
     </w:p>
     <w:p>
@@ -1051,7 +1051,7 @@
       </w:pPr>
       <w:r>
         <w:rPr/>
-        <w:t xml:space="preserve">การออกแบบมุ่งให้โมเดลเข้าใจคำสั่งภาษาไทยปนอังกฤษภายใต้ข้อมูลฝึกที่มีจำกัดและ GPU 4GB จึงใช้โมเดลถอดเสียงที่ฝึกไว้แล้วมาปรับแต่ง และทดลองโมเดลจำแนกเจตนาหลายแบบ เพื่อดูว่าความซับซ้อนของโมเดลและข้อมูลเฉพาะงานช่วยแก้ปัญหาได้อย่างไร</w:t>
+        <w:t xml:space="preserve">การออกแบบเน้นให้ระบบเข้าใจคำสั่งภาษาไทยผสมภาษาอังกฤษ แม้มีข้อมูลฝึกและหน่วยความจำ GPU จำกัดเพียง 4GB จึงนำโมเดลถอดเสียงที่มีอยู่แล้วมาปรับเพิ่มเติม และเปรียบเทียบโมเดลแยกคำสั่งหลายแบบ เพื่อหาวิธีที่เหมาะกับข้อมูลของโครงการ</w:t>
       </w:r>
     </w:p>
     <w:p>
@@ -1070,16 +1070,16 @@
       </w:pPr>
       <w:r>
         <w:rPr/>
-        <w:t xml:space="preserve">งานส่วนนี้คือจำแนกข้อความเป็น 6 intent จึงเปรียบเทียบโมเดลพื้นฐานที่ฝึกได้เร็วกับโมเดล deep learning ที่เรียนรู้รูปแบบและลำดับคำได้ โดยฝึกโมเดลจำแนกเจตนาจากข้อมูลของโครงการ</w:t>
-      </w:r>
-    </w:p>
-    <w:p>
-      <w:pPr>
-        <w:spacing w:lineRule="auto"/>
-      </w:pPr>
-      <w:r>
-        <w:rPr/>
-        <w:t xml:space="preserve">ก่อนฝึก ปรับช่องว่างในข้อความไทยแล้วตัดคำด้วย PyThaiNLP ให้เหมือนกันทั้งข้อมูลฝึกและข้อความจาก ASR เพราะ MASSIVE เว้นวรรคระหว่างคำ แต่ Whisper มักไม่เว้น จากนั้นใช้ TF-IDF แทนข้อความด้วยน้ำหนักของคำเดี่ยวและคู่คำติดกัน เพื่อให้โมเดลพื้นฐานใช้ทั้งคำสำคัญและวลีสั้น ๆ ในการจำแนก</w:t>
+        <w:t xml:space="preserve">ส่วนนี้ทำหน้าที่แยกข้อความเป็นคำสั่ง 6 แบบ โดยเปรียบเทียบโมเดลพื้นฐานที่ฝึกได้รวดเร็วกับโมเดล Deep Learning ที่เรียนรู้รูปแบบและลำดับของคำได้</w:t>
+      </w:r>
+    </w:p>
+    <w:p>
+      <w:pPr>
+        <w:spacing w:lineRule="auto"/>
+      </w:pPr>
+      <w:r>
+        <w:rPr/>
+        <w:t xml:space="preserve">ก่อนฝึกโมเดล ระบบจะจัดช่องว่างและตัดคำภาษาไทยด้วย PyThaiNLP ให้ข้อมูลฝึกมีรูปแบบเดียวกับข้อความจาก Whisper เพราะ MASSIVE เว้นวรรคระหว่างคำ แต่ Whisper มักไม่เว้น จากนั้นใช้ TF-IDF เปลี่ยนข้อความเป็นค่าตัวเลขตามความสำคัญของคำ เพื่อให้โมเดลพิจารณาได้ทั้งคำสำคัญและวลีสั้น ๆ</w:t>
       </w:r>
     </w:p>
     <w:p>
@@ -1098,7 +1098,7 @@
       </w:r>
       <w:r>
         <w:rPr/>
-        <w:t xml:space="preserve"> ใช้เป็นโมเดลพื้นฐาน เพราะฝึกและทำนายได้เร็ว เหมาะสำหรับทดลองว่าคำสำคัญในคำสั่งสั้น ๆ เพียงพอจะแยก intent ได้หรือไม่</w:t>
+        <w:t xml:space="preserve"> เป็นโมเดลพื้นฐานที่ฝึกและให้คำตอบได้เร็ว ใช้ทดสอบว่าคำสำคัญในประโยคเพียงพอสำหรับแยกคำสั่งหรือไม่</w:t>
       </w:r>
     </w:p>
     <w:p>
@@ -1117,7 +1117,7 @@
       </w:r>
       <w:r>
         <w:rPr/>
-        <w:t xml:space="preserve"> ใช้ TF-IDF แบบเดียวกับ Naive Bayes แต่เรียนรู้น้ำหนักของคำที่ช่วยแยกแต่ละ intent โดยตรง จึงใช้เปรียบเทียบวิธีจำแนกภายใต้ข้อมูลและคุณลักษณะเดียวกัน</w:t>
+        <w:t xml:space="preserve"> เรียนรู้ว่าคำใดมีความสำคัญต่อคำสั่งแต่ละแบบ โดยใช้ข้อมูล TF-IDF ชุดเดียวกับ Naive Bayes เพื่อให้เปรียบเทียบผลกันได้</w:t>
       </w:r>
     </w:p>
     <w:p>
@@ -1136,7 +1136,7 @@
       </w:r>
       <w:r>
         <w:rPr/>
-        <w:t xml:space="preserve"> เพิ่มคุณลักษณะจากตัวอักษรที่อยู่ติดกัน (character n-gram) เพราะคำที่ ASR ถอดผิดอาจยังมีบางส่วนคล้ายคำเดิม วิธีนี้จึงทดลองลดการพึ่งพาคำที่สะกดถูกครบทั้งคำ</w:t>
+        <w:t xml:space="preserve"> พิจารณาทั้งคำและกลุ่มตัวอักษรที่อยู่ติดกัน เพราะแม้ Whisper จะถอดคำผิด บางส่วนของคำนั้นอาจยังคล้ายคำเดิม</w:t>
       </w:r>
     </w:p>
     <w:p>
@@ -1183,7 +1183,7 @@
       </w:pPr>
       <w:r>
         <w:rPr/>
-        <w:t xml:space="preserve">TextCNN และ BiLSTM เรียนรู้ตัวแทนคำ (embedding) จากข้อมูลฝึกของโครงการ ใช้ dropout และหยุดฝึกเมื่อผลบนชุดพัฒนาไม่ดีขึ้น (early stopping) เพื่อลดการจดจำข้อมูลฝึกมากเกินไป โดยเก็บโมเดลที่ได้ macro-F1 บนชุดพัฒนาสูงสุด ซึ่งให้น้ำหนักแต่ละ intent เท่ากัน</w:t>
+        <w:t xml:space="preserve">TextCNN และ BiLSTM เรียนรู้ความหมายเชิงตัวเลขของคำจากข้อมูลโครงการ ระหว่างฝึกมีการปิดบางส่วนของโมเดลแบบสุ่ม (dropout) และหยุดฝึกเมื่อผลไม่ดีขึ้น (early stopping) เพื่อลดการจำข้อมูลฝึกมากเกินไป จากนั้นเลือกโมเดลที่ได้ค่า macro-F1 สูงสุด ซึ่งเป็นคะแนนที่ให้ความสำคัญกับคำสั่งทั้ง 6 แบบเท่ากัน</w:t>
       </w:r>
     </w:p>
     <w:p>
@@ -1202,7 +1202,7 @@
       </w:pPr>
       <w:r>
         <w:rPr/>
-        <w:t xml:space="preserve">เลือก Whisper เพราะมีความสามารถถอดเสียงหลายภาษาจากการฝึกไว้แล้ว จึงนำมาปรับให้เข้ากับภาษาและคำสั่งของโครงการได้โดยไม่ต้องฝึกโมเดลถอดเสียงใหม่ทั้งหมด แต่ละรหัส A0–A6 ระบุโมเดลที่มีขนาด วิธีฝึก หรือข้อมูลฝึกต่างกัน ดังนี้</w:t>
+        <w:t xml:space="preserve">เลือก Whisper เพราะเป็นโมเดล AI ที่แปลงเสียงหลายภาษาเป็นข้อความได้อยู่แล้ว จึงนำมาปรับให้เหมาะกับภาษาและคำสั่งของโครงการได้โดยไม่ต้องสร้างโมเดลใหม่ทั้งหมด รหัส A0–A6 ใช้แทนโมเดลที่มีขนาด วิธีฝึก หรือข้อมูลฝึกต่างกัน ดังนี้</w:t>
       </w:r>
     </w:p>
     <w:p>
@@ -1221,11 +1221,11 @@
       </w:r>
       <w:r>
         <w:rPr/>
-        <w:t xml:space="preserve"> ใช้รุ่นเล็กเพื่อทดสอบระบบบนทรัพยากรที่มี และเป็นจุดอ้างอิงก่อนปรับแต่งโมเดล ชื่อโมเดลคือ </w:t>
-      </w:r>
-      <w:r>
-        <w:rPr/>
-        <w:t xml:space="preserve">openai/whisper-tiny</w:t>
+        <w:t xml:space="preserve"> ใช้โมเดลขนาดเล็กเป็นผลเริ่มต้นสำหรับเปรียบเทียบกับรุ่นที่ปรับเพิ่มเติม ชื่อโมเดลคือ `openai/whisper-tiny`</w:t>
+      </w:r>
+      <w:r>
+        <w:rPr/>
+        <w:t xml:space="preserve"/>
       </w:r>
     </w:p>
     <w:p>
@@ -1240,15 +1240,15 @@
         <w:rPr>
           <w:b/>
         </w:rPr>
-        <w:t xml:space="preserve">A1 — Whisper-tiny ปรับแต่งด้วยภาษาไทย:</w:t>
-      </w:r>
-      <w:r>
-        <w:rPr/>
-        <w:t xml:space="preserve"> Fine-tune Whisper-tiny ด้วย FLEURS ภาษาไทย เพื่อให้โมเดลเรียนรู้การถอดเสียงไทยเพิ่มเติมจากข้อมูลเสียงและข้อความที่จับคู่กัน บันทึกที่ </w:t>
-      </w:r>
-      <w:r>
-        <w:rPr/>
-        <w:t xml:space="preserve">models/whisper-th</w:t>
+        <w:t xml:space="preserve">A1 — Whisper-tiny ปรับด้วยภาษาไทย:</w:t>
+      </w:r>
+      <w:r>
+        <w:rPr/>
+        <w:t xml:space="preserve"> นำ Whisper-tiny มาฝึกเพิ่มเติมด้วย Dataset ของ FLEURS ภาษาไทย เพื่อให้ถอดเสียงไทยได้ดีขึ้น บันทึกที่ `models/whisper-th`</w:t>
+      </w:r>
+      <w:r>
+        <w:rPr/>
+        <w:t xml:space="preserve"/>
       </w:r>
     </w:p>
     <w:p>
@@ -1267,11 +1267,11 @@
       </w:r>
       <w:r>
         <w:rPr/>
-        <w:t xml:space="preserve"> เนื่องจาก A1 ยังถอดคำสั่งจริงผิด จึงทดลองรุ่นที่ใหญ่ขึ้นเพื่อดูว่าความสามารถของโมเดลตั้งต้นช่วยแก้ปัญหาได้เพียงใด ชื่อโมเดลคือ </w:t>
-      </w:r>
-      <w:r>
-        <w:rPr/>
-        <w:t xml:space="preserve">openai/whisper-small</w:t>
+        <w:t xml:space="preserve"> เนื่องจาก A1 ยังถอดคำสั่งจริงผิด จึงทดลองรุ่นที่ใหญ่ขึ้นเพื่อดูว่าความสามารถของโมเดลตั้งต้นช่วยแก้ปัญหาได้เพียงใด ชื่อโมเดลคือ `openai/whisper-small`</w:t>
+      </w:r>
+      <w:r>
+        <w:rPr/>
+        <w:t xml:space="preserve"/>
       </w:r>
     </w:p>
     <w:p>
@@ -1290,11 +1290,11 @@
       </w:r>
       <w:r>
         <w:rPr/>
-        <w:t xml:space="preserve"> การปรับน้ำหนักทั้งหมดของ Whisper-small ใช้หน่วยความจำเกิน GPU 4GB จึงใช้ LoRA ซึ่งฝึกพารามิเตอร์เสริมขนาดเล็กแทน พร้อมเพิ่มเสียง TTS ของคำสั่ง เพราะ FLEURS ไม่ครอบคลุมคำสั่งจัดการงานและคำอังกฤษที่ใช้ในระบบ ปรับความเร็วและเพิ่มเสียงรบกวนเพื่อให้ข้อมูลเสียงมีความหลากหลายขึ้น บันทึกที่ </w:t>
-      </w:r>
-      <w:r>
-        <w:rPr/>
-        <w:t xml:space="preserve">models/whisper-small-th</w:t>
+        <w:t xml:space="preserve"> การปรับโมเดล Whisper-small ทั้งหมดใช้หน่วยความจำเกิน 4GB จึงใช้ LoRA เพื่อฝึกเฉพาะส่วนเสริมขนาดเล็ก และเพิ่มเสียงคำสั่งที่สร้างจากข้อความ เพราะ FLEURS ไม่มีคำสั่งจัดการงานและคำภาษาอังกฤษที่ระบบต้องใช้ นอกจากนี้ยังปรับความเร็วและเพิ่มเสียงรบกวนให้ข้อมูลมีความหลากหลายขึ้น บันทึกที่ `models/whisper-small-th`</w:t>
+      </w:r>
+      <w:r>
+        <w:rPr/>
+        <w:t xml:space="preserve"/>
       </w:r>
     </w:p>
     <w:p>
@@ -1313,11 +1313,11 @@
       </w:r>
       <w:r>
         <w:rPr/>
-        <w:t xml:space="preserve"> ใช้ LoRA และเสียงสังเคราะห์เช่นเดียวกับ A3 แล้วเพิ่มเสียงผู้ใช้จริง เพื่อให้โมเดลเรียนรู้ลักษณะเสียง การออกเสียง และคำไทยปนอังกฤษของผู้ใช้ (speaker adaptation) บันทึกที่ </w:t>
-      </w:r>
-      <w:r>
-        <w:rPr/>
-        <w:t xml:space="preserve">models/whisper-small-th-v2</w:t>
+        <w:t xml:space="preserve"> ใช้วิธีเดียวกับ A3 แล้วเพิ่มเสียงจริงของผู้ใช้ เพื่อให้โมเดลคุ้นเคยกับลักษณะเสียง การออกเสียง และการพูดภาษาไทยผสมภาษาอังกฤษ บันทึกที่ `models/whisper-small-th-v2`</w:t>
+      </w:r>
+      <w:r>
+        <w:rPr/>
+        <w:t xml:space="preserve"/>
       </w:r>
     </w:p>
     <w:p>
@@ -1336,11 +1336,11 @@
       </w:r>
       <w:r>
         <w:rPr/>
-        <w:t xml:space="preserve"> ใช้วิธีฝึกเดียวกับ A4 และเพิ่มเสียงผู้ใช้ที่เน้นตัวเลขเวลา เพราะเวลาในคำสั่งนัดหมายถอดผิดบ่อยและส่งผลต่อการสร้างนัดหมายโดยตรง บันทึกที่ </w:t>
-      </w:r>
-      <w:r>
-        <w:rPr/>
-        <w:t xml:space="preserve">models/whisper-small-th-v3</w:t>
+        <w:t xml:space="preserve"> ใช้วิธีฝึกเดียวกับ A4 และเพิ่มเสียงผู้ใช้ที่เน้นตัวเลขเวลา เพราะเวลาในคำสั่งนัดหมายถอดผิดบ่อยและส่งผลต่อการสร้างนัดหมายโดยตรง บันทึกที่ `models/whisper-small-th-v3`</w:t>
+      </w:r>
+      <w:r>
+        <w:rPr/>
+        <w:t xml:space="preserve"/>
       </w:r>
     </w:p>
     <w:p>
@@ -1359,53 +1359,53 @@
       </w:r>
       <w:r>
         <w:rPr/>
-        <w:t xml:space="preserve"> ใช้ข้อมูลและวิธีฝึกเดียวกับ A5 แต่เพิ่มจำนวนขั้นฝึกจาก 800 เป็น 1,200 เพราะข้อผิดพลาดบนชุดพัฒนายังลดลงเมื่อจบการฝึกรอบเดิม จึงทดลองว่าการฝึกต่อช่วยกับคำสั่งจริงด้วยหรือไม่ บันทึกที่ </w:t>
-      </w:r>
-      <w:r>
-        <w:rPr/>
-        <w:t xml:space="preserve">models/whisper-small-th-v4</w:t>
-      </w:r>
-    </w:p>
-    <w:p>
-      <w:pPr>
-        <w:spacing w:lineRule="auto"/>
-      </w:pPr>
-      <w:r>
-        <w:rPr/>
-        <w:t xml:space="preserve">เลขในรหัส A0–A6 นับรวมการทดลองทั้ง Whisper-tiny และ Whisper-small ส่วน </w:t>
-      </w:r>
-      <w:r>
-        <w:rPr/>
-        <w:t xml:space="preserve">v2</w:t>
-      </w:r>
-      <w:r>
-        <w:rPr/>
-        <w:t xml:space="preserve">, </w:t>
-      </w:r>
-      <w:r>
-        <w:rPr/>
-        <w:t xml:space="preserve">v3</w:t>
-      </w:r>
-      <w:r>
-        <w:rPr/>
-        <w:t xml:space="preserve"> และ </w:t>
-      </w:r>
-      <w:r>
-        <w:rPr/>
-        <w:t xml:space="preserve">v4</w:t>
-      </w:r>
-      <w:r>
-        <w:rPr/>
-        <w:t xml:space="preserve"> ในชื่อโฟลเดอร์ใช้ระบุรุ่นของ Whisper-small ที่ปรับแต่งในโครงการ จึงตรงกับรหัส A4, A5 และ A6 ตามลำดับ</w:t>
-      </w:r>
-    </w:p>
-    <w:p>
-      <w:pPr>
-        <w:spacing w:lineRule="auto"/>
-      </w:pPr>
-      <w:r>
-        <w:rPr/>
-        <w:t xml:space="preserve">ระหว่างฝึกเก็บโมเดลที่มี CER หรืออัตราความผิดพลาดระดับตัวอักษรต่ำสุดบนชุดพัฒนา FLEURS แล้วนำแต่ละรุ่นไปประเมินกับเสียงคำสั่งจริง เพราะผลบนเสียงทั่วไปอาจไม่สะท้อนการใช้งานในระบบ</w:t>
+        <w:t xml:space="preserve"> ใช้ข้อมูลและวิธีฝึกเดียวกับ A5 แต่เพิ่มจำนวนขั้นฝึกจาก 800 เป็น 1,200 เพราะข้อผิดพลาดบนชุดพัฒนายังลดลงเมื่อจบการฝึกรอบเดิม จึงทดลองว่าการฝึกต่อช่วยกับคำสั่งจริงด้วยหรือไม่ บันทึกที่ `models/whisper-small-th-v4`</w:t>
+      </w:r>
+      <w:r>
+        <w:rPr/>
+        <w:t xml:space="preserve"/>
+      </w:r>
+    </w:p>
+    <w:p>
+      <w:pPr>
+        <w:spacing w:lineRule="auto"/>
+      </w:pPr>
+      <w:r>
+        <w:rPr/>
+        <w:t xml:space="preserve">เลขในรหัส A0–A6 นับรวมการทดลองทั้ง Whisper-tiny และ Whisper-small ส่วน v2, v3 และ v4 ในชื่อโฟลเดอร์ใช้ระบุรุ่นของ Whisper-small ที่ปรับแต่งในโครงการ จึงตรงกับรหัส A4, A5 และ A6 ตามลำดับ</w:t>
+      </w:r>
+      <w:r>
+        <w:rPr/>
+        <w:t xml:space="preserve"/>
+      </w:r>
+      <w:r>
+        <w:rPr/>
+        <w:t xml:space="preserve"/>
+      </w:r>
+      <w:r>
+        <w:rPr/>
+        <w:t xml:space="preserve"/>
+      </w:r>
+      <w:r>
+        <w:rPr/>
+        <w:t xml:space="preserve"/>
+      </w:r>
+      <w:r>
+        <w:rPr/>
+        <w:t xml:space="preserve"/>
+      </w:r>
+      <w:r>
+        <w:rPr/>
+        <w:t xml:space="preserve"/>
+      </w:r>
+    </w:p>
+    <w:p>
+      <w:pPr>
+        <w:spacing w:lineRule="auto"/>
+      </w:pPr>
+      <w:r>
+        <w:rPr/>
+        <w:t xml:space="preserve">ระหว่างฝึกจะเก็บโมเดลที่มีอัตราความผิดพลาดระดับตัวอักษร (CER) ต่ำที่สุดบนชุดตรวจสอบของ FLEURS แล้วนำไปทดสอบกับเสียงคำสั่งจริงอีกครั้ง เพราะผลจากเสียงทั่วไปอาจไม่ตรงกับผลเมื่อใช้งานจริง</w:t>
       </w:r>
     </w:p>
     <w:p>
@@ -1424,7 +1424,7 @@
       </w:pPr>
       <w:r>
         <w:rPr/>
-        <w:t xml:space="preserve">ชุดข้อมูลฝึก I1–I4 ใช้ MASSIVE เป็นฐาน ซึ่งมีตัวอย่างภาษาไทยและอังกฤษ แต่คำสั่งบางหมวดต่างจากงานของระบบ เช่น หมวด “lists” ส่วนใหญ่เป็นรายการซื้อของ จึงค่อย ๆ เพิ่มข้อมูลคำสั่งจัดการงานและนัดหมาย รวมถึงข้อความที่ถอดเสียงผิด เพื่อให้ข้อมูลฝึกใกล้กับสิ่งที่โมเดลได้รับตอนใช้งาน</w:t>
+        <w:t xml:space="preserve">ชุดข้อมูลฝึก I1–I4 เริ่มจาก Dataset ของ MASSIVE ซึ่งมีตัวอย่างภาษาไทยและอังกฤษ แต่บางหมวดไม่ตรงกับงานของระบบ เช่น หมวด “lists” ที่ส่วนใหญ่เป็นรายการซื้อของ จึงเพิ่มคำสั่งเกี่ยวกับงาน นัดหมาย และตัวอย่างข้อความที่ Whisper ถอดผิด เพื่อให้ข้อมูลฝึกใกล้กับสิ่งที่พบเมื่อใช้งานจริง</w:t>
       </w:r>
     </w:p>
     <w:p>
@@ -1443,15 +1443,15 @@
       </w:r>
       <w:r>
         <w:rPr/>
-        <w:t xml:space="preserve"> ใช้ MASSIVE ภาษาไทยและอังกฤษร่วมกับประโยคที่เขียนเอง และลดจำนวนตัวอย่าง </w:t>
-      </w:r>
-      <w:r>
-        <w:rPr/>
-        <w:t xml:space="preserve">other</w:t>
-      </w:r>
-      <w:r>
-        <w:rPr/>
-        <w:t xml:space="preserve"> เพราะมีมากกว่าหมวดคำสั่งที่ต้องการ เพื่อไม่ให้ข้อมูลส่วนนี้ครอบงำการฝึก</w:t>
+        <w:t xml:space="preserve"> ใช้ MASSIVE ภาษาไทยและอังกฤษร่วมกับประโยคที่ผู้พัฒนาเขียน และลดจำนวนตัวอย่าง `other` เพราะมีมากกว่าคำสั่งประเภทอื่น เพื่อให้ข้อมูลแต่ละประเภทสมดุลขึ้น</w:t>
+      </w:r>
+      <w:r>
+        <w:rPr/>
+        <w:t xml:space="preserve"/>
+      </w:r>
+      <w:r>
+        <w:rPr/>
+        <w:t xml:space="preserve"/>
       </w:r>
     </w:p>
     <w:p>
@@ -1466,11 +1466,11 @@
         <w:rPr>
           <w:b/>
         </w:rPr>
-        <w:t xml:space="preserve">I2 — ชุดข้อมูลเพิ่มคำสั่งเฉพาะงานและข้อผิดพลาดจาก ASR:</w:t>
-      </w:r>
-      <w:r>
-        <w:rPr/>
-        <w:t xml:space="preserve"> เพิ่มประโยคที่ Claude ช่วยเขียนเพื่อขยายสำนวนคำสั่ง และเพิ่มข้อความที่ ASR ถอดผิด เพื่อให้โมเดลพบข้อผิดพลาดที่อาจเกิดขึ้นจริง ทำซ้ำข้อมูลเฉพาะงานในชุดฝึก (oversampling) เพื่อให้มีน้ำหนักเพียงพอเมื่อรวมกับ MASSIVE</w:t>
+        <w:t xml:space="preserve">I2 — เพิ่มคำสั่งเฉพาะงานและตัวอย่างที่ถอดเสียงผิด:</w:t>
+      </w:r>
+      <w:r>
+        <w:rPr/>
+        <w:t xml:space="preserve"> เพิ่มประโยคที่ Claude ช่วยสร้างเพื่อให้มีรูปแบบคำสั่งหลากหลายขึ้น พร้อมเพิ่มข้อความที่ Whisper ถอดผิด และเพิ่มจำนวนตัวอย่างเฉพาะงาน เพื่อไม่ให้มีสัดส่วนน้อยเกินไปเมื่อรวมกับ MASSIVE</w:t>
       </w:r>
     </w:p>
     <w:p>
@@ -1517,7 +1517,7 @@
       </w:pPr>
       <w:r>
         <w:rPr/>
-        <w:t xml:space="preserve">การสร้างข้อความที่มีข้อผิดพลาดทำโดยนำประโยคคำสั่งไปสร้างเสียงด้วย gTTS ปรับความเร็วและเพิ่มเสียงรบกวน แล้วถอดกลับด้วย Whisper โดยคงป้าย intent ของประโยคต้นฉบับไว้ วิธีนี้ช่วยให้ชุดฝึกมีข้อความใกล้เคียงผลจาก ASR แทนที่จะมีเฉพาะข้อความที่เขียนถูกต้อง ผลการเปรียบเทียบโมเดลและข้อมูลฝึกแต่ละรุ่นแสดงในบทที่ 4</w:t>
+        <w:t xml:space="preserve">ตัวอย่างข้อความที่ถอดผิดสร้างโดยนำประโยคคำสั่งไปสร้างเป็นเสียงด้วย gTTS จากนั้นปรับความเร็ว เพิ่มเสียงรบกวน และใช้ Whisper แปลงกลับเป็นข้อความ โดยยังระบุประเภทคำสั่งเหมือนประโยคเดิม วิธีนี้ทำให้โมเดลได้เรียนรู้ทั้งข้อความที่เขียนถูกและข้อความที่อาจถอดผิดจริง ผลการเปรียบเทียบแสดงในบทที่ 4</w:t>
       </w:r>
     </w:p>
     <w:p>
@@ -1532,13 +1532,12 @@
     </w:p>
     <w:p>
       <w:pPr>
-        <w:spacing w:lineRule="auto"/>
-      </w:pPr>
-      <w:r>
-        <w:rPr>
-          <w:b/>
-        </w:rPr>
-        <w:t xml:space="preserve">เครื่องมือ:</w:t>
+        <w:pStyle w:val="Heading4"/>
+        <w:spacing w:lineRule="auto"/>
+      </w:pPr>
+      <w:r>
+        <w:rPr/>
+        <w:t xml:space="preserve">3.5.1 เครื่องมือที่ใช้</w:t>
       </w:r>
     </w:p>
     <w:p>
@@ -1576,7 +1575,7 @@
       </w:r>
       <w:r>
         <w:rPr/>
-        <w:t xml:space="preserve"> ฝึกและใช้งานโมเดล deep learning บน GPU</w:t>
+        <w:t xml:space="preserve"> ใช้ฝึกและเรียกใช้งานโมเดล Deep Learning บน GPU</w:t>
       </w:r>
     </w:p>
     <w:p>
@@ -1595,7 +1594,7 @@
       </w:r>
       <w:r>
         <w:rPr/>
-        <w:t xml:space="preserve"> ใช้ transformers, peft, accelerate และ evaluate สำหรับโหลด ปรับแต่ง และประเมินโมเดล Whisper</w:t>
+        <w:t xml:space="preserve"> ใช้เครื่องมือ transformers, peft, accelerate และ evaluate สำหรับดาวน์โหลด ปรับ และวัดผลโมเดล Whisper</w:t>
       </w:r>
     </w:p>
     <w:p>
@@ -1690,7 +1689,7 @@
       </w:r>
       <w:r>
         <w:rPr/>
-        <w:t xml:space="preserve"> คำนวณข้อผิดพลาดในการถอดเสียงด้วย CER และ WER</w:t>
+        <w:t xml:space="preserve"> คำนวณอัตราความผิดพลาดระดับตัวอักษร (CER) และระดับคำ (WER)</w:t>
       </w:r>
     </w:p>
     <w:p>
@@ -1769,809 +1768,183 @@
         <w:t xml:space="preserve"> GPU ที่ใช้ฝึกโมเดล</w:t>
       </w:r>
     </w:p>
-    <w:tbl>
-      <w:tblPr>
-        <w:tblBorders>
-          <w:top w:val="single" w:sz="2" w:space="0" w:color="000000"/>
-          <w:bottom w:val="single" w:sz="2" w:space="0" w:color="000000"/>
-          <w:left w:val="single" w:sz="2" w:space="0" w:color="000000"/>
-          <w:right w:val="single" w:sz="2" w:space="0" w:color="000000"/>
-        </w:tblBorders>
-        <w:tblCellSpacing w:w="0" w:type="dxa"/>
-        <w:tblCellMar>
-          <w:top w:type="dxa" w:w="80"/>
-          <w:bottom w:type="dxa" w:w="80"/>
-          <w:left w:type="dxa" w:w="160"/>
-          <w:right w:type="dxa" w:w="160"/>
-        </w:tblCellMar>
-        <w:jc w:val="center"/>
-      </w:tblPr>
-      <w:tblGrid>
-        <w:gridCol w:w="2160"/>
-        <w:gridCol w:w="2160"/>
-        <w:gridCol w:w="2160"/>
-        <w:gridCol w:w="2160"/>
-      </w:tblGrid>
-      <w:tr>
-        <w:trPr/>
-        <w:tc>
-          <w:tcPr>
-            <w:tcBorders>
-              <w:top w:val="single" w:sz="1" w:space="0" w:color="000000"/>
-              <w:bottom w:val="single" w:sz="1" w:space="0" w:color="000000"/>
-              <w:left w:val="single" w:sz="1" w:space="0" w:color="000000"/>
-              <w:right w:val="single" w:sz="1" w:space="0" w:color="000000"/>
-            </w:tcBorders>
-          </w:tcPr>
-          <w:p>
-            <w:pPr>
-              <w:spacing w:lineRule="auto"/>
-            </w:pPr>
-            <w:r>
-              <w:rPr/>
-              <w:t xml:space="preserve">Dataset</w:t>
-            </w:r>
-          </w:p>
-        </w:tc>
-        <w:tc>
-          <w:tcPr>
-            <w:tcBorders>
-              <w:top w:val="single" w:sz="1" w:space="0" w:color="000000"/>
-              <w:bottom w:val="single" w:sz="1" w:space="0" w:color="000000"/>
-              <w:left w:val="single" w:sz="1" w:space="0" w:color="000000"/>
-              <w:right w:val="single" w:sz="1" w:space="0" w:color="000000"/>
-            </w:tcBorders>
-          </w:tcPr>
-          <w:p>
-            <w:pPr>
-              <w:spacing w:lineRule="auto"/>
-            </w:pPr>
-            <w:r>
-              <w:rPr/>
-              <w:t xml:space="preserve">ที่มา</w:t>
-            </w:r>
-          </w:p>
-        </w:tc>
-        <w:tc>
-          <w:tcPr>
-            <w:tcBorders>
-              <w:top w:val="single" w:sz="1" w:space="0" w:color="000000"/>
-              <w:bottom w:val="single" w:sz="1" w:space="0" w:color="000000"/>
-              <w:left w:val="single" w:sz="1" w:space="0" w:color="000000"/>
-              <w:right w:val="single" w:sz="1" w:space="0" w:color="000000"/>
-            </w:tcBorders>
-          </w:tcPr>
-          <w:p>
-            <w:pPr>
-              <w:spacing w:lineRule="auto"/>
-            </w:pPr>
-            <w:r>
-              <w:rPr/>
-              <w:t xml:space="preserve">ขนาด</w:t>
-            </w:r>
-          </w:p>
-        </w:tc>
-        <w:tc>
-          <w:tcPr>
-            <w:tcBorders>
-              <w:top w:val="single" w:sz="1" w:space="0" w:color="000000"/>
-              <w:bottom w:val="single" w:sz="1" w:space="0" w:color="000000"/>
-              <w:left w:val="single" w:sz="1" w:space="0" w:color="000000"/>
-              <w:right w:val="single" w:sz="1" w:space="0" w:color="000000"/>
-            </w:tcBorders>
-          </w:tcPr>
-          <w:p>
-            <w:pPr>
-              <w:spacing w:lineRule="auto"/>
-            </w:pPr>
-            <w:r>
-              <w:rPr/>
-              <w:t xml:space="preserve">ใช้ทำอะไร</w:t>
-            </w:r>
-          </w:p>
-        </w:tc>
-      </w:tr>
-      <w:tblGrid>
-        <w:gridCol w:w="2160"/>
-        <w:gridCol w:w="2160"/>
-        <w:gridCol w:w="2160"/>
-        <w:gridCol w:w="2160"/>
-      </w:tblGrid>
-      <w:tr>
-        <w:trPr/>
-        <w:tc>
-          <w:tcPr>
-            <w:tcBorders>
-              <w:top w:val="single" w:sz="1" w:space="0" w:color="000000"/>
-              <w:bottom w:val="single" w:sz="1" w:space="0" w:color="000000"/>
-              <w:left w:val="single" w:sz="1" w:space="0" w:color="000000"/>
-              <w:right w:val="single" w:sz="1" w:space="0" w:color="000000"/>
-            </w:tcBorders>
-          </w:tcPr>
-          <w:p>
-            <w:pPr>
-              <w:spacing w:lineRule="auto"/>
-            </w:pPr>
-            <w:hyperlink r:id="rId6">
-              <w:r>
-                <w:rPr>
-                  <w:rStyle w:val="Hyperlink"/>
-                </w:rPr>
-                <w:t xml:space="preserve">MASSIVE</w:t>
-              </w:r>
-            </w:hyperlink>
-          </w:p>
-          <w:p>
-            <w:pPr>
-              <w:spacing w:lineRule="auto"/>
-            </w:pPr>
-            <w:r>
-              <w:rPr/>
-              <w:t xml:space="preserve"> th-TH + en-US</w:t>
-            </w:r>
-          </w:p>
-        </w:tc>
-        <w:tc>
-          <w:tcPr>
-            <w:tcBorders>
-              <w:top w:val="single" w:sz="1" w:space="0" w:color="000000"/>
-              <w:bottom w:val="single" w:sz="1" w:space="0" w:color="000000"/>
-              <w:left w:val="single" w:sz="1" w:space="0" w:color="000000"/>
-              <w:right w:val="single" w:sz="1" w:space="0" w:color="000000"/>
-            </w:tcBorders>
-          </w:tcPr>
-          <w:p>
-            <w:pPr>
-              <w:spacing w:lineRule="auto"/>
-            </w:pPr>
-            <w:r>
-              <w:rPr/>
-              <w:t xml:space="preserve">Amazon, CC-BY-4.0</w:t>
-            </w:r>
-          </w:p>
-        </w:tc>
-        <w:tc>
-          <w:tcPr>
-            <w:tcBorders>
-              <w:top w:val="single" w:sz="1" w:space="0" w:color="000000"/>
-              <w:bottom w:val="single" w:sz="1" w:space="0" w:color="000000"/>
-              <w:left w:val="single" w:sz="1" w:space="0" w:color="000000"/>
-              <w:right w:val="single" w:sz="1" w:space="0" w:color="000000"/>
-            </w:tcBorders>
-          </w:tcPr>
-          <w:p>
-            <w:pPr>
-              <w:spacing w:lineRule="auto"/>
-            </w:pPr>
-            <w:r>
-              <w:rPr/>
-              <w:t xml:space="preserve">~11.5k train / 2k dev / 3k test ต่อภาษา</w:t>
-            </w:r>
-          </w:p>
-        </w:tc>
-        <w:tc>
-          <w:tcPr>
-            <w:tcBorders>
-              <w:top w:val="single" w:sz="1" w:space="0" w:color="000000"/>
-              <w:bottom w:val="single" w:sz="1" w:space="0" w:color="000000"/>
-              <w:left w:val="single" w:sz="1" w:space="0" w:color="000000"/>
-              <w:right w:val="single" w:sz="1" w:space="0" w:color="000000"/>
-            </w:tcBorders>
-          </w:tcPr>
-          <w:p>
-            <w:pPr>
-              <w:spacing w:lineRule="auto"/>
-            </w:pPr>
-            <w:r>
-              <w:rPr/>
-              <w:t xml:space="preserve">เทรน/ทดสอบ intent (แมป 60 → 6 intent)</w:t>
-            </w:r>
-          </w:p>
-        </w:tc>
-      </w:tr>
-      <w:tr>
-        <w:trPr/>
-        <w:tc>
-          <w:tcPr>
-            <w:tcBorders>
-              <w:top w:val="single" w:sz="1" w:space="0" w:color="000000"/>
-              <w:bottom w:val="single" w:sz="1" w:space="0" w:color="000000"/>
-              <w:left w:val="single" w:sz="1" w:space="0" w:color="000000"/>
-              <w:right w:val="single" w:sz="1" w:space="0" w:color="000000"/>
-            </w:tcBorders>
-          </w:tcPr>
-          <w:p>
-            <w:pPr>
-              <w:spacing w:lineRule="auto"/>
-            </w:pPr>
-            <w:hyperlink r:id="rId7">
-              <w:r>
-                <w:rPr>
-                  <w:rStyle w:val="Hyperlink"/>
-                </w:rPr>
-                <w:t xml:space="preserve">FLEURS</w:t>
-              </w:r>
-            </w:hyperlink>
-          </w:p>
-          <w:p>
-            <w:pPr>
-              <w:spacing w:lineRule="auto"/>
-            </w:pPr>
-            <w:r>
-              <w:rPr/>
-              <w:t xml:space="preserve"> th_th</w:t>
-            </w:r>
-          </w:p>
-        </w:tc>
-        <w:tc>
-          <w:tcPr>
-            <w:tcBorders>
-              <w:top w:val="single" w:sz="1" w:space="0" w:color="000000"/>
-              <w:bottom w:val="single" w:sz="1" w:space="0" w:color="000000"/>
-              <w:left w:val="single" w:sz="1" w:space="0" w:color="000000"/>
-              <w:right w:val="single" w:sz="1" w:space="0" w:color="000000"/>
-            </w:tcBorders>
-          </w:tcPr>
-          <w:p>
-            <w:pPr>
-              <w:spacing w:lineRule="auto"/>
-            </w:pPr>
-            <w:r>
-              <w:rPr/>
-              <w:t xml:space="preserve">Google, CC-BY-4.0</w:t>
-            </w:r>
-          </w:p>
-        </w:tc>
-        <w:tc>
-          <w:tcPr>
-            <w:tcBorders>
-              <w:top w:val="single" w:sz="1" w:space="0" w:color="000000"/>
-              <w:bottom w:val="single" w:sz="1" w:space="0" w:color="000000"/>
-              <w:left w:val="single" w:sz="1" w:space="0" w:color="000000"/>
-              <w:right w:val="single" w:sz="1" w:space="0" w:color="000000"/>
-            </w:tcBorders>
-          </w:tcPr>
-          <w:p>
-            <w:pPr>
-              <w:spacing w:lineRule="auto"/>
-            </w:pPr>
-            <w:r>
-              <w:rPr/>
-              <w:t xml:space="preserve">2,602 train (8.5 ชม.) / 439 dev / 1,021 test</w:t>
-            </w:r>
-          </w:p>
-        </w:tc>
-        <w:tc>
-          <w:tcPr>
-            <w:tcBorders>
-              <w:top w:val="single" w:sz="1" w:space="0" w:color="000000"/>
-              <w:bottom w:val="single" w:sz="1" w:space="0" w:color="000000"/>
-              <w:left w:val="single" w:sz="1" w:space="0" w:color="000000"/>
-              <w:right w:val="single" w:sz="1" w:space="0" w:color="000000"/>
-            </w:tcBorders>
-          </w:tcPr>
-          <w:p>
-            <w:pPr>
-              <w:spacing w:lineRule="auto"/>
-            </w:pPr>
-            <w:r>
-              <w:rPr/>
-              <w:t xml:space="preserve">Fine-tune และทดสอบ ASR</w:t>
-            </w:r>
-          </w:p>
-        </w:tc>
-      </w:tr>
-      <w:tr>
-        <w:trPr/>
-        <w:tc>
-          <w:tcPr>
-            <w:tcBorders>
-              <w:top w:val="single" w:sz="1" w:space="0" w:color="000000"/>
-              <w:bottom w:val="single" w:sz="1" w:space="0" w:color="000000"/>
-              <w:left w:val="single" w:sz="1" w:space="0" w:color="000000"/>
-              <w:right w:val="single" w:sz="1" w:space="0" w:color="000000"/>
-            </w:tcBorders>
-          </w:tcPr>
-          <w:p>
-            <w:pPr>
-              <w:spacing w:lineRule="auto"/>
-            </w:pPr>
-            <w:r>
-              <w:rPr>
-                <w:highlight w:val="lightGray"/>
-              </w:rPr>
-              <w:t xml:space="preserve">data/custom_intents.csv</w:t>
-            </w:r>
-          </w:p>
-        </w:tc>
-        <w:tc>
-          <w:tcPr>
-            <w:tcBorders>
-              <w:top w:val="single" w:sz="1" w:space="0" w:color="000000"/>
-              <w:bottom w:val="single" w:sz="1" w:space="0" w:color="000000"/>
-              <w:left w:val="single" w:sz="1" w:space="0" w:color="000000"/>
-              <w:right w:val="single" w:sz="1" w:space="0" w:color="000000"/>
-            </w:tcBorders>
-          </w:tcPr>
-          <w:p>
-            <w:pPr>
-              <w:spacing w:lineRule="auto"/>
-            </w:pPr>
-            <w:r>
-              <w:rPr/>
-              <w:t xml:space="preserve">เขียนเอง</w:t>
-            </w:r>
-          </w:p>
-        </w:tc>
-        <w:tc>
-          <w:tcPr>
-            <w:tcBorders>
-              <w:top w:val="single" w:sz="1" w:space="0" w:color="000000"/>
-              <w:bottom w:val="single" w:sz="1" w:space="0" w:color="000000"/>
-              <w:left w:val="single" w:sz="1" w:space="0" w:color="000000"/>
-              <w:right w:val="single" w:sz="1" w:space="0" w:color="000000"/>
-            </w:tcBorders>
-          </w:tcPr>
-          <w:p>
-            <w:pPr>
-              <w:spacing w:lineRule="auto"/>
-            </w:pPr>
-            <w:r>
-              <w:rPr/>
-              <w:t xml:space="preserve">30 ประโยค</w:t>
-            </w:r>
-          </w:p>
-        </w:tc>
-        <w:tc>
-          <w:tcPr>
-            <w:tcBorders>
-              <w:top w:val="single" w:sz="1" w:space="0" w:color="000000"/>
-              <w:bottom w:val="single" w:sz="1" w:space="0" w:color="000000"/>
-              <w:left w:val="single" w:sz="1" w:space="0" w:color="000000"/>
-              <w:right w:val="single" w:sz="1" w:space="0" w:color="000000"/>
-            </w:tcBorders>
-          </w:tcPr>
-          <w:p>
-            <w:pPr>
-              <w:spacing w:lineRule="auto"/>
-            </w:pPr>
-            <w:r>
-              <w:rPr/>
-              <w:t xml:space="preserve">เทรน intent</w:t>
-            </w:r>
-          </w:p>
-        </w:tc>
-      </w:tr>
-      <w:tr>
-        <w:trPr/>
-        <w:tc>
-          <w:tcPr>
-            <w:tcBorders>
-              <w:top w:val="single" w:sz="1" w:space="0" w:color="000000"/>
-              <w:bottom w:val="single" w:sz="1" w:space="0" w:color="000000"/>
-              <w:left w:val="single" w:sz="1" w:space="0" w:color="000000"/>
-              <w:right w:val="single" w:sz="1" w:space="0" w:color="000000"/>
-            </w:tcBorders>
-          </w:tcPr>
-          <w:p>
-            <w:pPr>
-              <w:spacing w:lineRule="auto"/>
-            </w:pPr>
-            <w:r>
-              <w:rPr>
-                <w:highlight w:val="lightGray"/>
-              </w:rPr>
-              <w:t xml:space="preserve">data/generated_intents.csv</w:t>
-            </w:r>
-          </w:p>
-        </w:tc>
-        <w:tc>
-          <w:tcPr>
-            <w:tcBorders>
-              <w:top w:val="single" w:sz="1" w:space="0" w:color="000000"/>
-              <w:bottom w:val="single" w:sz="1" w:space="0" w:color="000000"/>
-              <w:left w:val="single" w:sz="1" w:space="0" w:color="000000"/>
-              <w:right w:val="single" w:sz="1" w:space="0" w:color="000000"/>
-            </w:tcBorders>
-          </w:tcPr>
-          <w:p>
-            <w:pPr>
-              <w:spacing w:lineRule="auto"/>
-            </w:pPr>
-            <w:r>
-              <w:rPr/>
-              <w:t xml:space="preserve">เขียนโดย Claude</w:t>
-            </w:r>
-          </w:p>
-        </w:tc>
-        <w:tc>
-          <w:tcPr>
-            <w:tcBorders>
-              <w:top w:val="single" w:sz="1" w:space="0" w:color="000000"/>
-              <w:bottom w:val="single" w:sz="1" w:space="0" w:color="000000"/>
-              <w:left w:val="single" w:sz="1" w:space="0" w:color="000000"/>
-              <w:right w:val="single" w:sz="1" w:space="0" w:color="000000"/>
-            </w:tcBorders>
-          </w:tcPr>
-          <w:p>
-            <w:pPr>
-              <w:spacing w:lineRule="auto"/>
-            </w:pPr>
-            <w:r>
-              <w:rPr/>
-              <w:t xml:space="preserve">150 ประโยค (25/intent)</w:t>
-            </w:r>
-          </w:p>
-        </w:tc>
-        <w:tc>
-          <w:tcPr>
-            <w:tcBorders>
-              <w:top w:val="single" w:sz="1" w:space="0" w:color="000000"/>
-              <w:bottom w:val="single" w:sz="1" w:space="0" w:color="000000"/>
-              <w:left w:val="single" w:sz="1" w:space="0" w:color="000000"/>
-              <w:right w:val="single" w:sz="1" w:space="0" w:color="000000"/>
-            </w:tcBorders>
-          </w:tcPr>
-          <w:p>
-            <w:pPr>
-              <w:spacing w:lineRule="auto"/>
-            </w:pPr>
-            <w:r>
-              <w:rPr/>
-              <w:t xml:space="preserve">เทรน intent</w:t>
-            </w:r>
-          </w:p>
-        </w:tc>
-      </w:tr>
-      <w:tr>
-        <w:trPr/>
-        <w:tc>
-          <w:tcPr>
-            <w:tcBorders>
-              <w:top w:val="single" w:sz="1" w:space="0" w:color="000000"/>
-              <w:bottom w:val="single" w:sz="1" w:space="0" w:color="000000"/>
-              <w:left w:val="single" w:sz="1" w:space="0" w:color="000000"/>
-              <w:right w:val="single" w:sz="1" w:space="0" w:color="000000"/>
-            </w:tcBorders>
-          </w:tcPr>
-          <w:p>
-            <w:pPr>
-              <w:spacing w:lineRule="auto"/>
-            </w:pPr>
-            <w:r>
-              <w:rPr>
-                <w:highlight w:val="lightGray"/>
-              </w:rPr>
-              <w:t xml:space="preserve">data/augmented_intents.csv</w:t>
-            </w:r>
-          </w:p>
-        </w:tc>
-        <w:tc>
-          <w:tcPr>
-            <w:tcBorders>
-              <w:top w:val="single" w:sz="1" w:space="0" w:color="000000"/>
-              <w:bottom w:val="single" w:sz="1" w:space="0" w:color="000000"/>
-              <w:left w:val="single" w:sz="1" w:space="0" w:color="000000"/>
-              <w:right w:val="single" w:sz="1" w:space="0" w:color="000000"/>
-            </w:tcBorders>
-          </w:tcPr>
-          <w:p>
-            <w:pPr>
-              <w:spacing w:lineRule="auto"/>
-            </w:pPr>
-            <w:r>
-              <w:rPr/>
-              <w:t xml:space="preserve">gTTS → Whisper</w:t>
-            </w:r>
-          </w:p>
-        </w:tc>
-        <w:tc>
-          <w:tcPr>
-            <w:tcBorders>
-              <w:top w:val="single" w:sz="1" w:space="0" w:color="000000"/>
-              <w:bottom w:val="single" w:sz="1" w:space="0" w:color="000000"/>
-              <w:left w:val="single" w:sz="1" w:space="0" w:color="000000"/>
-              <w:right w:val="single" w:sz="1" w:space="0" w:color="000000"/>
-            </w:tcBorders>
-          </w:tcPr>
-          <w:p>
-            <w:pPr>
-              <w:spacing w:lineRule="auto"/>
-            </w:pPr>
-            <w:r>
-              <w:rPr/>
-              <w:t xml:space="preserve">720 แถว</w:t>
-            </w:r>
-          </w:p>
-        </w:tc>
-        <w:tc>
-          <w:tcPr>
-            <w:tcBorders>
-              <w:top w:val="single" w:sz="1" w:space="0" w:color="000000"/>
-              <w:bottom w:val="single" w:sz="1" w:space="0" w:color="000000"/>
-              <w:left w:val="single" w:sz="1" w:space="0" w:color="000000"/>
-              <w:right w:val="single" w:sz="1" w:space="0" w:color="000000"/>
-            </w:tcBorders>
-          </w:tcPr>
-          <w:p>
-            <w:pPr>
-              <w:spacing w:lineRule="auto"/>
-            </w:pPr>
-            <w:r>
-              <w:rPr/>
-              <w:t xml:space="preserve">เทรน intent ให้ทน ASR error</w:t>
-            </w:r>
-          </w:p>
-        </w:tc>
-      </w:tr>
-      <w:tr>
-        <w:trPr/>
-        <w:tc>
-          <w:tcPr>
-            <w:tcBorders>
-              <w:top w:val="single" w:sz="1" w:space="0" w:color="000000"/>
-              <w:bottom w:val="single" w:sz="1" w:space="0" w:color="000000"/>
-              <w:left w:val="single" w:sz="1" w:space="0" w:color="000000"/>
-              <w:right w:val="single" w:sz="1" w:space="0" w:color="000000"/>
-            </w:tcBorders>
-          </w:tcPr>
-          <w:p>
-            <w:pPr>
-              <w:spacing w:lineRule="auto"/>
-            </w:pPr>
-            <w:r>
-              <w:rPr>
-                <w:highlight w:val="lightGray"/>
-              </w:rPr>
-              <w:t xml:space="preserve">data/audio_train/</w:t>
-            </w:r>
-          </w:p>
-        </w:tc>
-        <w:tc>
-          <w:tcPr>
-            <w:tcBorders>
-              <w:top w:val="single" w:sz="1" w:space="0" w:color="000000"/>
-              <w:bottom w:val="single" w:sz="1" w:space="0" w:color="000000"/>
-              <w:left w:val="single" w:sz="1" w:space="0" w:color="000000"/>
-              <w:right w:val="single" w:sz="1" w:space="0" w:color="000000"/>
-            </w:tcBorders>
-          </w:tcPr>
-          <w:p>
-            <w:pPr>
-              <w:spacing w:lineRule="auto"/>
-            </w:pPr>
-            <w:r>
-              <w:rPr/>
-              <w:t xml:space="preserve">อัดเสียงผู้ใช้</w:t>
-            </w:r>
-          </w:p>
-        </w:tc>
-        <w:tc>
-          <w:tcPr>
-            <w:tcBorders>
-              <w:top w:val="single" w:sz="1" w:space="0" w:color="000000"/>
-              <w:bottom w:val="single" w:sz="1" w:space="0" w:color="000000"/>
-              <w:left w:val="single" w:sz="1" w:space="0" w:color="000000"/>
-              <w:right w:val="single" w:sz="1" w:space="0" w:color="000000"/>
-            </w:tcBorders>
-          </w:tcPr>
-          <w:p>
-            <w:pPr>
-              <w:spacing w:lineRule="auto"/>
-            </w:pPr>
-            <w:r>
-              <w:rPr/>
-              <w:t xml:space="preserve">112 ประโยค</w:t>
-            </w:r>
-          </w:p>
-        </w:tc>
-        <w:tc>
-          <w:tcPr>
-            <w:tcBorders>
-              <w:top w:val="single" w:sz="1" w:space="0" w:color="000000"/>
-              <w:bottom w:val="single" w:sz="1" w:space="0" w:color="000000"/>
-              <w:left w:val="single" w:sz="1" w:space="0" w:color="000000"/>
-              <w:right w:val="single" w:sz="1" w:space="0" w:color="000000"/>
-            </w:tcBorders>
-          </w:tcPr>
-          <w:p>
-            <w:pPr>
-              <w:spacing w:lineRule="auto"/>
-            </w:pPr>
-            <w:r>
-              <w:rPr/>
-              <w:t xml:space="preserve">เทรน ASR (speaker adaptation) + intent</w:t>
-            </w:r>
-          </w:p>
-        </w:tc>
-      </w:tr>
-      <w:tr>
-        <w:trPr/>
-        <w:tc>
-          <w:tcPr>
-            <w:tcBorders>
-              <w:top w:val="single" w:sz="1" w:space="0" w:color="000000"/>
-              <w:bottom w:val="single" w:sz="1" w:space="0" w:color="000000"/>
-              <w:left w:val="single" w:sz="1" w:space="0" w:color="000000"/>
-              <w:right w:val="single" w:sz="1" w:space="0" w:color="000000"/>
-            </w:tcBorders>
-          </w:tcPr>
-          <w:p>
-            <w:pPr>
-              <w:spacing w:lineRule="auto"/>
-            </w:pPr>
-            <w:r>
-              <w:rPr>
-                <w:highlight w:val="lightGray"/>
-              </w:rPr>
-              <w:t xml:space="preserve">data/audio/</w:t>
-            </w:r>
-          </w:p>
-          <w:p>
-            <w:pPr>
-              <w:spacing w:lineRule="auto"/>
-            </w:pPr>
-            <w:r>
-              <w:rPr/>
-              <w:t xml:space="preserve"> (test)</w:t>
-            </w:r>
-          </w:p>
-        </w:tc>
-        <w:tc>
-          <w:tcPr>
-            <w:tcBorders>
-              <w:top w:val="single" w:sz="1" w:space="0" w:color="000000"/>
-              <w:bottom w:val="single" w:sz="1" w:space="0" w:color="000000"/>
-              <w:left w:val="single" w:sz="1" w:space="0" w:color="000000"/>
-              <w:right w:val="single" w:sz="1" w:space="0" w:color="000000"/>
-            </w:tcBorders>
-          </w:tcPr>
-          <w:p>
-            <w:pPr>
-              <w:spacing w:lineRule="auto"/>
-            </w:pPr>
-            <w:r>
-              <w:rPr/>
-              <w:t xml:space="preserve">อัดเสียงผู้ใช้</w:t>
-            </w:r>
-          </w:p>
-        </w:tc>
-        <w:tc>
-          <w:tcPr>
-            <w:tcBorders>
-              <w:top w:val="single" w:sz="1" w:space="0" w:color="000000"/>
-              <w:bottom w:val="single" w:sz="1" w:space="0" w:color="000000"/>
-              <w:left w:val="single" w:sz="1" w:space="0" w:color="000000"/>
-              <w:right w:val="single" w:sz="1" w:space="0" w:color="000000"/>
-            </w:tcBorders>
-          </w:tcPr>
-          <w:p>
-            <w:pPr>
-              <w:spacing w:lineRule="auto"/>
-            </w:pPr>
-            <w:r>
-              <w:rPr/>
-              <w:t xml:space="preserve">60 ประโยค (10/intent)</w:t>
-            </w:r>
-          </w:p>
-        </w:tc>
-        <w:tc>
-          <w:tcPr>
-            <w:tcBorders>
-              <w:top w:val="single" w:sz="1" w:space="0" w:color="000000"/>
-              <w:bottom w:val="single" w:sz="1" w:space="0" w:color="000000"/>
-              <w:left w:val="single" w:sz="1" w:space="0" w:color="000000"/>
-              <w:right w:val="single" w:sz="1" w:space="0" w:color="000000"/>
-            </w:tcBorders>
-          </w:tcPr>
-          <w:p>
-            <w:pPr>
-              <w:spacing w:lineRule="auto"/>
-            </w:pPr>
-            <w:r>
-              <w:rPr/>
-              <w:t xml:space="preserve">ทดสอบ end-to-end เท่านั้น</w:t>
-            </w:r>
-          </w:p>
-        </w:tc>
-      </w:tr>
-      <w:tr>
-        <w:trPr/>
-        <w:tc>
-          <w:tcPr>
-            <w:tcBorders>
-              <w:top w:val="single" w:sz="1" w:space="0" w:color="000000"/>
-              <w:bottom w:val="single" w:sz="1" w:space="0" w:color="000000"/>
-              <w:left w:val="single" w:sz="1" w:space="0" w:color="000000"/>
-              <w:right w:val="single" w:sz="1" w:space="0" w:color="000000"/>
-            </w:tcBorders>
-          </w:tcPr>
-          <w:p>
-            <w:pPr>
-              <w:spacing w:lineRule="auto"/>
-            </w:pPr>
-            <w:r>
-              <w:rPr>
-                <w:highlight w:val="lightGray"/>
-              </w:rPr>
-              <w:t xml:space="preserve">data/slots_gold.csv</w:t>
-            </w:r>
-          </w:p>
-        </w:tc>
-        <w:tc>
-          <w:tcPr>
-            <w:tcBorders>
-              <w:top w:val="single" w:sz="1" w:space="0" w:color="000000"/>
-              <w:bottom w:val="single" w:sz="1" w:space="0" w:color="000000"/>
-              <w:left w:val="single" w:sz="1" w:space="0" w:color="000000"/>
-              <w:right w:val="single" w:sz="1" w:space="0" w:color="000000"/>
-            </w:tcBorders>
-          </w:tcPr>
-          <w:p>
-            <w:pPr>
-              <w:spacing w:lineRule="auto"/>
-            </w:pPr>
-            <w:r>
-              <w:rPr/>
-              <w:t xml:space="preserve">เขียนเฉลยเอง</w:t>
-            </w:r>
-          </w:p>
-        </w:tc>
-        <w:tc>
-          <w:tcPr>
-            <w:tcBorders>
-              <w:top w:val="single" w:sz="1" w:space="0" w:color="000000"/>
-              <w:bottom w:val="single" w:sz="1" w:space="0" w:color="000000"/>
-              <w:left w:val="single" w:sz="1" w:space="0" w:color="000000"/>
-              <w:right w:val="single" w:sz="1" w:space="0" w:color="000000"/>
-            </w:tcBorders>
-          </w:tcPr>
-          <w:p>
-            <w:pPr>
-              <w:spacing w:lineRule="auto"/>
-            </w:pPr>
-            <w:r>
-              <w:rPr/>
-              <w:t xml:space="preserve">30 ประโยค</w:t>
-            </w:r>
-          </w:p>
-        </w:tc>
-        <w:tc>
-          <w:tcPr>
-            <w:tcBorders>
-              <w:top w:val="single" w:sz="1" w:space="0" w:color="000000"/>
-              <w:bottom w:val="single" w:sz="1" w:space="0" w:color="000000"/>
-              <w:left w:val="single" w:sz="1" w:space="0" w:color="000000"/>
-              <w:right w:val="single" w:sz="1" w:space="0" w:color="000000"/>
-            </w:tcBorders>
-          </w:tcPr>
-          <w:p>
-            <w:pPr>
-              <w:spacing w:lineRule="auto"/>
-            </w:pPr>
-            <w:r>
-              <w:rPr/>
-              <w:t xml:space="preserve">ทดสอบ slot</w:t>
-            </w:r>
-          </w:p>
-        </w:tc>
-      </w:tr>
-    </w:tbl>
-    <w:p>
-      <w:pPr>
-        <w:spacing w:lineRule="auto"/>
-      </w:pPr>
-      <w:r>
-        <w:rPr/>
-      </w:r>
-    </w:p>
-    <w:p>
-      <w:pPr>
-        <w:spacing w:lineRule="auto"/>
-      </w:pPr>
-      <w:r>
-        <w:rPr/>
-        <w:t xml:space="preserve">ชุดทดสอบแยกจากชุดเทรน: ประโยคใน test มี similarity กับ train สูงสุด 0.73</w:t>
+    <w:p>
+      <w:pPr>
+        <w:pStyle w:val="Heading4"/>
+        <w:spacing w:lineRule="auto"/>
+      </w:pPr>
+      <w:r>
+        <w:rPr/>
+        <w:t xml:space="preserve">3.5.2 ชุดข้อมูลที่ใช้</w:t>
+      </w:r>
+    </w:p>
+    <w:p>
+      <w:pPr>
+        <w:numPr>
+          <w:ilvl w:val="0"/>
+          <w:numId w:val="10"/>
+        </w:numPr>
+        <w:spacing w:lineRule="auto"/>
+      </w:pPr>
+      <w:r>
+        <w:rPr>
+          <w:b/>
+        </w:rPr>
+        <w:t xml:space="preserve">Dataset ของ MASSIVE:</w:t>
+      </w:r>
+      <w:r>
+        <w:rPr/>
+        <w:t xml:space="preserve"> ข้อความคำสั่งภาษาไทยและภาษาอังกฤษ ใช้ฝึกและทดสอบโมเดลจำแนกประเภทคำสั่ง โดยมีข้อมูลฝึกประมาณ 11,500 ประโยคต่อภาษา</w:t>
+      </w:r>
+    </w:p>
+    <w:p>
+      <w:pPr>
+        <w:numPr>
+          <w:ilvl w:val="0"/>
+          <w:numId w:val="10"/>
+        </w:numPr>
+        <w:spacing w:lineRule="auto"/>
+      </w:pPr>
+      <w:r>
+        <w:rPr>
+          <w:b/>
+        </w:rPr>
+        <w:t xml:space="preserve">Dataset ของ FLEURS:</w:t>
+      </w:r>
+      <w:r>
+        <w:rPr/>
+        <w:t xml:space="preserve"> เสียงพูดภาษาไทยพร้อมข้อความถอดเสียง ใช้ปรับและทดสอบ Whisper โดยมีข้อมูลฝึก 2,602 เสียง รวมประมาณ 8.5 ชั่วโมง</w:t>
+      </w:r>
+    </w:p>
+    <w:p>
+      <w:pPr>
+        <w:numPr>
+          <w:ilvl w:val="0"/>
+          <w:numId w:val="10"/>
+        </w:numPr>
+        <w:spacing w:lineRule="auto"/>
+      </w:pPr>
+      <w:r>
+        <w:rPr>
+          <w:b/>
+        </w:rPr>
+        <w:t xml:space="preserve">ชุดข้อความคำสั่งที่ผู้พัฒนาเขียน:</w:t>
+      </w:r>
+      <w:r>
+        <w:rPr/>
+        <w:t xml:space="preserve"> ข้อความคำสั่งเฉพาะงาน 30 ประโยคใน data/custom_intents.csv ใช้ฝึกโมเดลจำแนกประเภทคำสั่ง</w:t>
+      </w:r>
+    </w:p>
+    <w:p>
+      <w:pPr>
+        <w:numPr>
+          <w:ilvl w:val="0"/>
+          <w:numId w:val="10"/>
+        </w:numPr>
+        <w:spacing w:lineRule="auto"/>
+      </w:pPr>
+      <w:r>
+        <w:rPr>
+          <w:b/>
+        </w:rPr>
+        <w:t xml:space="preserve">ชุดข้อความคำสั่งที่ Claude สร้าง:</w:t>
+      </w:r>
+      <w:r>
+        <w:rPr/>
+        <w:t xml:space="preserve"> ข้อความคำสั่งหลายรูปแบบ 150 ประโยคใน data/generated_intents.csv ใช้เพิ่มความหลากหลายให้ข้อมูลฝึก</w:t>
+      </w:r>
+    </w:p>
+    <w:p>
+      <w:pPr>
+        <w:numPr>
+          <w:ilvl w:val="0"/>
+          <w:numId w:val="10"/>
+        </w:numPr>
+        <w:spacing w:lineRule="auto"/>
+      </w:pPr>
+      <w:r>
+        <w:rPr>
+          <w:b/>
+        </w:rPr>
+        <w:t xml:space="preserve">ชุดข้อความที่จำลองข้อผิดพลาดของ Whisper:</w:t>
+      </w:r>
+      <w:r>
+        <w:rPr/>
+        <w:t xml:space="preserve"> ข้อความ 720 ประโยคใน data/augmented_intents.csv สร้างผ่าน gTTS และ Whisper เพื่อช่วยให้โมเดลรับมือกับข้อความที่ถอดผิด</w:t>
+      </w:r>
+    </w:p>
+    <w:p>
+      <w:pPr>
+        <w:numPr>
+          <w:ilvl w:val="0"/>
+          <w:numId w:val="10"/>
+        </w:numPr>
+        <w:spacing w:lineRule="auto"/>
+      </w:pPr>
+      <w:r>
+        <w:rPr>
+          <w:b/>
+        </w:rPr>
+        <w:t xml:space="preserve">ชุดไฟล์เสียงคำสั่งที่ผู้พัฒนาอัดสำหรับฝึกโมเดล:</w:t>
+      </w:r>
+      <w:r>
+        <w:rPr/>
+        <w:t xml:space="preserve"> เสียงคำสั่ง 112 เสียงพร้อมข้อความใน data/audio_train/ ใช้ปรับ Whisper และฝึกโมเดลจำแนกประเภทคำสั่ง</w:t>
+      </w:r>
+    </w:p>
+    <w:p>
+      <w:pPr>
+        <w:numPr>
+          <w:ilvl w:val="0"/>
+          <w:numId w:val="10"/>
+        </w:numPr>
+        <w:spacing w:lineRule="auto"/>
+      </w:pPr>
+      <w:r>
+        <w:rPr>
+          <w:b/>
+        </w:rPr>
+        <w:t xml:space="preserve">ชุดไฟล์เสียงคำสั่งสำหรับทดสอบระบบ:</w:t>
+      </w:r>
+      <w:r>
+        <w:rPr/>
+        <w:t xml:space="preserve"> เสียงคำสั่ง 60 เสียงใน data/audio/ อัดแยกจากชุดฝึก และใช้ทดสอบการทำงานของระบบทั้งหมด</w:t>
+      </w:r>
+    </w:p>
+    <w:p>
+      <w:pPr>
+        <w:numPr>
+          <w:ilvl w:val="0"/>
+          <w:numId w:val="10"/>
+        </w:numPr>
+        <w:spacing w:lineRule="auto"/>
+      </w:pPr>
+      <w:r>
+        <w:rPr>
+          <w:b/>
+        </w:rPr>
+        <w:t xml:space="preserve">ชุดคำตอบสำหรับทดสอบการดึงข้อมูล:</w:t>
+      </w:r>
+      <w:r>
+        <w:rPr/>
+        <w:t xml:space="preserve"> คำตอบที่ถูกต้องของชื่องาน วัน และเวลา 30 ประโยคใน data/slots_gold.csv ใช้ตรวจสอบการดึงรายละเอียดจากคำสั่ง</w:t>
+      </w:r>
+    </w:p>
+    <w:p>
+      <w:pPr>
+        <w:spacing w:lineRule="auto"/>
+      </w:pPr>
+      <w:r>
+        <w:rPr/>
+      </w:r>
+    </w:p>
+    <w:p>
+      <w:pPr>
+        <w:spacing w:lineRule="auto"/>
+      </w:pPr>
+      <w:r>
+        <w:rPr/>
+        <w:t xml:space="preserve">ชุดเสียงทดสอบถูกแยกออกจากชุดข้อมูลฝึก โดยประโยคที่คล้ายกับข้อมูลฝึกมากที่สุดมีค่าความคล้าย 0.73 จึงไม่มีประโยคที่เหมือนกับข้อมูลฝึกทั้งหมด</w:t>
       </w:r>
     </w:p>
     <w:p>

</xml_diff>